<commit_message>
Update kafka-ui config and refresh Day 05 assets
Add Kafka Connect dependency and connection info to kafka-ui service in docker-compose: include 'connect' in depends_on, change bootstrap server to kafka:29092, and add KAFKA_CLUSTERS_0_KAFKACONNECT_* env vars (name and address). Also update Day 05 lab guide (.docx) and slides (.pptx). These changes ensure kafka-ui can reach the Kafka broker on the correct port and discover the Connect cluster.
</commit_message>
<xml_diff>
--- a/Week_01/Day_05/Lab/Day_05_Lab_Guide.docx
+++ b/Week_01/Day_05/Lab/Day_05_Lab_Guide.docx
@@ -44,9 +44,7 @@
         </w:rPr>
       </w:pPr>
       <w:r>
-        <w:rPr>
-          <w:rFonts w:ascii="Calibri" w:hAnsi="Calibri"/>
-        </w:rPr>
+        <w:rPr/>
         <w:t>What Students Will Build</w:t>
       </w:r>
     </w:p>
@@ -110,6 +108,7 @@
             <w:pPr>
               <w:pStyle w:val="Normal"/>
               <w:widowControl/>
+              <w:suppressAutoHyphens w:val="true"/>
               <w:spacing w:lineRule="auto" w:line="240" w:before="0" w:after="0"/>
               <w:jc w:val="start"/>
               <w:rPr>
@@ -140,6 +139,7 @@
             <w:pPr>
               <w:pStyle w:val="Normal"/>
               <w:widowControl/>
+              <w:suppressAutoHyphens w:val="true"/>
               <w:spacing w:lineRule="auto" w:line="240" w:before="0" w:after="0"/>
               <w:jc w:val="start"/>
               <w:rPr>
@@ -170,6 +170,7 @@
             <w:pPr>
               <w:pStyle w:val="Normal"/>
               <w:widowControl/>
+              <w:suppressAutoHyphens w:val="true"/>
               <w:spacing w:lineRule="auto" w:line="240" w:before="0" w:after="0"/>
               <w:jc w:val="start"/>
               <w:rPr>
@@ -202,6 +203,7 @@
             <w:pPr>
               <w:pStyle w:val="Normal"/>
               <w:widowControl/>
+              <w:suppressAutoHyphens w:val="true"/>
               <w:spacing w:lineRule="auto" w:line="240" w:before="0" w:after="0"/>
               <w:jc w:val="start"/>
               <w:rPr>
@@ -231,6 +233,7 @@
             <w:pPr>
               <w:pStyle w:val="Normal"/>
               <w:widowControl/>
+              <w:suppressAutoHyphens w:val="true"/>
               <w:spacing w:lineRule="auto" w:line="240" w:before="0" w:after="0"/>
               <w:jc w:val="start"/>
               <w:rPr>
@@ -260,6 +263,7 @@
             <w:pPr>
               <w:pStyle w:val="Normal"/>
               <w:widowControl/>
+              <w:suppressAutoHyphens w:val="true"/>
               <w:spacing w:lineRule="auto" w:line="240" w:before="0" w:after="0"/>
               <w:jc w:val="start"/>
               <w:rPr>
@@ -292,6 +296,7 @@
             <w:pPr>
               <w:pStyle w:val="Normal"/>
               <w:widowControl/>
+              <w:suppressAutoHyphens w:val="true"/>
               <w:spacing w:lineRule="auto" w:line="240" w:before="0" w:after="0"/>
               <w:jc w:val="start"/>
               <w:rPr>
@@ -321,6 +326,7 @@
             <w:pPr>
               <w:pStyle w:val="Normal"/>
               <w:widowControl/>
+              <w:suppressAutoHyphens w:val="true"/>
               <w:spacing w:lineRule="auto" w:line="240" w:before="0" w:after="0"/>
               <w:jc w:val="start"/>
               <w:rPr>
@@ -350,6 +356,7 @@
             <w:pPr>
               <w:pStyle w:val="Normal"/>
               <w:widowControl/>
+              <w:suppressAutoHyphens w:val="true"/>
               <w:spacing w:lineRule="auto" w:line="240" w:before="0" w:after="0"/>
               <w:jc w:val="start"/>
               <w:rPr>
@@ -382,6 +389,7 @@
             <w:pPr>
               <w:pStyle w:val="Normal"/>
               <w:widowControl/>
+              <w:suppressAutoHyphens w:val="true"/>
               <w:spacing w:lineRule="auto" w:line="240" w:before="0" w:after="0"/>
               <w:jc w:val="start"/>
               <w:rPr>
@@ -411,6 +419,7 @@
             <w:pPr>
               <w:pStyle w:val="Normal"/>
               <w:widowControl/>
+              <w:suppressAutoHyphens w:val="true"/>
               <w:spacing w:lineRule="auto" w:line="240" w:before="0" w:after="0"/>
               <w:jc w:val="start"/>
               <w:rPr>
@@ -440,6 +449,7 @@
             <w:pPr>
               <w:pStyle w:val="Normal"/>
               <w:widowControl/>
+              <w:suppressAutoHyphens w:val="true"/>
               <w:spacing w:lineRule="auto" w:line="240" w:before="0" w:after="0"/>
               <w:jc w:val="start"/>
               <w:rPr>
@@ -472,6 +482,7 @@
             <w:pPr>
               <w:pStyle w:val="Normal"/>
               <w:widowControl/>
+              <w:suppressAutoHyphens w:val="true"/>
               <w:spacing w:lineRule="auto" w:line="240" w:before="0" w:after="0"/>
               <w:jc w:val="start"/>
               <w:rPr>
@@ -501,6 +512,7 @@
             <w:pPr>
               <w:pStyle w:val="Normal"/>
               <w:widowControl/>
+              <w:suppressAutoHyphens w:val="true"/>
               <w:spacing w:lineRule="auto" w:line="240" w:before="0" w:after="0"/>
               <w:jc w:val="start"/>
               <w:rPr>
@@ -530,6 +542,7 @@
             <w:pPr>
               <w:pStyle w:val="Normal"/>
               <w:widowControl/>
+              <w:suppressAutoHyphens w:val="true"/>
               <w:spacing w:lineRule="auto" w:line="240" w:before="0" w:after="0"/>
               <w:jc w:val="start"/>
               <w:rPr>
@@ -560,9 +573,7 @@
         </w:rPr>
       </w:pPr>
       <w:r>
-        <w:rPr>
-          <w:rFonts w:ascii="Calibri" w:hAnsi="Calibri"/>
-        </w:rPr>
+        <w:rPr/>
         <w:t>Prerequisites</w:t>
       </w:r>
     </w:p>
@@ -630,9 +641,7 @@
         </w:rPr>
       </w:pPr>
       <w:r>
-        <w:rPr>
-          <w:rFonts w:ascii="Calibri" w:hAnsi="Calibri"/>
-        </w:rPr>
+        <w:rPr/>
         <w:t>Slide Topic Map for the Lab</w:t>
       </w:r>
     </w:p>
@@ -685,6 +694,7 @@
             <w:pPr>
               <w:pStyle w:val="Normal"/>
               <w:widowControl/>
+              <w:suppressAutoHyphens w:val="true"/>
               <w:spacing w:lineRule="auto" w:line="240" w:before="0" w:after="0"/>
               <w:jc w:val="start"/>
               <w:rPr>
@@ -718,6 +728,7 @@
             <w:pPr>
               <w:pStyle w:val="Normal"/>
               <w:widowControl/>
+              <w:suppressAutoHyphens w:val="true"/>
               <w:spacing w:lineRule="auto" w:line="240" w:before="0" w:after="0"/>
               <w:jc w:val="start"/>
               <w:rPr>
@@ -751,6 +762,7 @@
             <w:pPr>
               <w:pStyle w:val="Normal"/>
               <w:widowControl/>
+              <w:suppressAutoHyphens w:val="true"/>
               <w:spacing w:lineRule="auto" w:line="240" w:before="0" w:after="0"/>
               <w:jc w:val="start"/>
               <w:rPr>
@@ -784,6 +796,7 @@
             <w:pPr>
               <w:pStyle w:val="Normal"/>
               <w:widowControl/>
+              <w:suppressAutoHyphens w:val="true"/>
               <w:spacing w:lineRule="auto" w:line="240" w:before="0" w:after="0"/>
               <w:jc w:val="start"/>
               <w:rPr>
@@ -819,6 +832,7 @@
             <w:pPr>
               <w:pStyle w:val="Normal"/>
               <w:widowControl/>
+              <w:suppressAutoHyphens w:val="true"/>
               <w:spacing w:lineRule="auto" w:line="240" w:before="0" w:after="0"/>
               <w:jc w:val="start"/>
               <w:rPr>
@@ -851,6 +865,7 @@
             <w:pPr>
               <w:pStyle w:val="Normal"/>
               <w:widowControl/>
+              <w:suppressAutoHyphens w:val="true"/>
               <w:spacing w:lineRule="auto" w:line="240" w:before="0" w:after="0"/>
               <w:jc w:val="start"/>
               <w:rPr>
@@ -883,6 +898,7 @@
             <w:pPr>
               <w:pStyle w:val="Normal"/>
               <w:widowControl/>
+              <w:suppressAutoHyphens w:val="true"/>
               <w:spacing w:lineRule="auto" w:line="240" w:before="0" w:after="0"/>
               <w:jc w:val="start"/>
               <w:rPr>
@@ -915,6 +931,7 @@
             <w:pPr>
               <w:pStyle w:val="Normal"/>
               <w:widowControl/>
+              <w:suppressAutoHyphens w:val="true"/>
               <w:spacing w:lineRule="auto" w:line="240" w:before="0" w:after="0"/>
               <w:jc w:val="start"/>
               <w:rPr>
@@ -950,6 +967,7 @@
             <w:pPr>
               <w:pStyle w:val="Normal"/>
               <w:widowControl/>
+              <w:suppressAutoHyphens w:val="true"/>
               <w:spacing w:lineRule="auto" w:line="240" w:before="0" w:after="0"/>
               <w:jc w:val="start"/>
               <w:rPr>
@@ -982,6 +1000,7 @@
             <w:pPr>
               <w:pStyle w:val="Normal"/>
               <w:widowControl/>
+              <w:suppressAutoHyphens w:val="true"/>
               <w:spacing w:lineRule="auto" w:line="240" w:before="0" w:after="0"/>
               <w:jc w:val="start"/>
               <w:rPr>
@@ -1014,6 +1033,7 @@
             <w:pPr>
               <w:pStyle w:val="Normal"/>
               <w:widowControl/>
+              <w:suppressAutoHyphens w:val="true"/>
               <w:spacing w:lineRule="auto" w:line="240" w:before="0" w:after="0"/>
               <w:jc w:val="start"/>
               <w:rPr>
@@ -1046,6 +1066,7 @@
             <w:pPr>
               <w:pStyle w:val="Normal"/>
               <w:widowControl/>
+              <w:suppressAutoHyphens w:val="true"/>
               <w:spacing w:lineRule="auto" w:line="240" w:before="0" w:after="0"/>
               <w:jc w:val="start"/>
               <w:rPr>
@@ -1081,6 +1102,7 @@
             <w:pPr>
               <w:pStyle w:val="Normal"/>
               <w:widowControl/>
+              <w:suppressAutoHyphens w:val="true"/>
               <w:spacing w:lineRule="auto" w:line="240" w:before="0" w:after="0"/>
               <w:jc w:val="start"/>
               <w:rPr>
@@ -1113,6 +1135,7 @@
             <w:pPr>
               <w:pStyle w:val="Normal"/>
               <w:widowControl/>
+              <w:suppressAutoHyphens w:val="true"/>
               <w:spacing w:lineRule="auto" w:line="240" w:before="0" w:after="0"/>
               <w:jc w:val="start"/>
               <w:rPr>
@@ -1145,6 +1168,7 @@
             <w:pPr>
               <w:pStyle w:val="Normal"/>
               <w:widowControl/>
+              <w:suppressAutoHyphens w:val="true"/>
               <w:spacing w:lineRule="auto" w:line="240" w:before="0" w:after="0"/>
               <w:jc w:val="start"/>
               <w:rPr>
@@ -1177,6 +1201,7 @@
             <w:pPr>
               <w:pStyle w:val="Normal"/>
               <w:widowControl/>
+              <w:suppressAutoHyphens w:val="true"/>
               <w:spacing w:lineRule="auto" w:line="240" w:before="0" w:after="0"/>
               <w:jc w:val="start"/>
               <w:rPr>
@@ -1212,6 +1237,7 @@
             <w:pPr>
               <w:pStyle w:val="Normal"/>
               <w:widowControl/>
+              <w:suppressAutoHyphens w:val="true"/>
               <w:spacing w:lineRule="auto" w:line="240" w:before="0" w:after="0"/>
               <w:jc w:val="start"/>
               <w:rPr>
@@ -1244,6 +1270,7 @@
             <w:pPr>
               <w:pStyle w:val="Normal"/>
               <w:widowControl/>
+              <w:suppressAutoHyphens w:val="true"/>
               <w:spacing w:lineRule="auto" w:line="240" w:before="0" w:after="0"/>
               <w:jc w:val="start"/>
               <w:rPr>
@@ -1276,6 +1303,7 @@
             <w:pPr>
               <w:pStyle w:val="Normal"/>
               <w:widowControl/>
+              <w:suppressAutoHyphens w:val="true"/>
               <w:spacing w:lineRule="auto" w:line="240" w:before="0" w:after="0"/>
               <w:jc w:val="start"/>
               <w:rPr>
@@ -1308,6 +1336,7 @@
             <w:pPr>
               <w:pStyle w:val="Normal"/>
               <w:widowControl/>
+              <w:suppressAutoHyphens w:val="true"/>
               <w:spacing w:lineRule="auto" w:line="240" w:before="0" w:after="0"/>
               <w:jc w:val="start"/>
               <w:rPr>
@@ -1343,6 +1372,7 @@
             <w:pPr>
               <w:pStyle w:val="Normal"/>
               <w:widowControl/>
+              <w:suppressAutoHyphens w:val="true"/>
               <w:spacing w:lineRule="auto" w:line="240" w:before="0" w:after="0"/>
               <w:jc w:val="start"/>
               <w:rPr>
@@ -1375,6 +1405,7 @@
             <w:pPr>
               <w:pStyle w:val="Normal"/>
               <w:widowControl/>
+              <w:suppressAutoHyphens w:val="true"/>
               <w:spacing w:lineRule="auto" w:line="240" w:before="0" w:after="0"/>
               <w:jc w:val="start"/>
               <w:rPr>
@@ -1407,6 +1438,7 @@
             <w:pPr>
               <w:pStyle w:val="Normal"/>
               <w:widowControl/>
+              <w:suppressAutoHyphens w:val="true"/>
               <w:spacing w:lineRule="auto" w:line="240" w:before="0" w:after="0"/>
               <w:jc w:val="start"/>
               <w:rPr>
@@ -1439,6 +1471,7 @@
             <w:pPr>
               <w:pStyle w:val="Normal"/>
               <w:widowControl/>
+              <w:suppressAutoHyphens w:val="true"/>
               <w:spacing w:lineRule="auto" w:line="240" w:before="0" w:after="0"/>
               <w:jc w:val="start"/>
               <w:rPr>
@@ -1471,9 +1504,7 @@
         </w:rPr>
       </w:pPr>
       <w:r>
-        <w:rPr>
-          <w:rFonts w:ascii="Calibri" w:hAnsi="Calibri"/>
-        </w:rPr>
+        <w:rPr/>
         <w:t>Exercise 1 - Validate the lab workspace</w:t>
       </w:r>
     </w:p>
@@ -1594,7 +1625,139 @@
           <w:color w:val="263242"/>
           <w:sz w:val="18"/>
         </w:rPr>
-        <w:t>cd Week_01/Day_05/Lab_Files</w:t>
+        <w:t>python run_day5_lab_tests.py</w:t>
+      </w:r>
+    </w:p>
+    <w:p>
+      <w:pPr>
+        <w:pStyle w:val="Normal"/>
+        <w:ind w:start="360"/>
+        <w:rPr>
+          <w:rFonts w:ascii="Calibri" w:hAnsi="Calibri"/>
+        </w:rPr>
+      </w:pPr>
+      <w:r>
+        <w:rPr>
+          <w:rFonts w:ascii="Calibri" w:hAnsi="Calibri"/>
+          <w:b/>
+        </w:rPr>
+        <w:t xml:space="preserve">Expected output: </w:t>
+      </w:r>
+      <w:r>
+        <w:rPr>
+          <w:rFonts w:ascii="Calibri" w:hAnsi="Calibri"/>
+        </w:rPr>
+        <w:t>The proof runner prints PASS lines for Bronze events, duplicate quarantine, DLQ records, Gold KPIs, schema decisions, and docker compose config.</w:t>
+      </w:r>
+    </w:p>
+    <w:p>
+      <w:pPr>
+        <w:pStyle w:val="Normal"/>
+        <w:rPr>
+          <w:rFonts w:ascii="Calibri" w:hAnsi="Calibri"/>
+        </w:rPr>
+      </w:pPr>
+      <w:r>
+        <w:rPr>
+          <w:rFonts w:ascii="Calibri" w:hAnsi="Calibri"/>
+          <w:b/>
+        </w:rPr>
+        <w:t xml:space="preserve">Mini exercise: </w:t>
+      </w:r>
+      <w:r>
+        <w:rPr>
+          <w:rFonts w:ascii="Calibri" w:hAnsi="Calibri"/>
+        </w:rPr>
+        <w:t>Which command proves the Docker Compose file is valid without starting Kafka?</w:t>
+      </w:r>
+    </w:p>
+    <w:p>
+      <w:pPr>
+        <w:pStyle w:val="Normal"/>
+        <w:rPr>
+          <w:rFonts w:ascii="Calibri" w:hAnsi="Calibri"/>
+        </w:rPr>
+      </w:pPr>
+      <w:r>
+        <w:rPr>
+          <w:rFonts w:ascii="Calibri" w:hAnsi="Calibri"/>
+          <w:b/>
+        </w:rPr>
+        <w:t xml:space="preserve">Solution: </w:t>
+      </w:r>
+      <w:r>
+        <w:rPr>
+          <w:rFonts w:ascii="Calibri" w:hAnsi="Calibri"/>
+        </w:rPr>
+        <w:t>docker compose config. The proof runner already executes it, but running it directly is useful when troubleshooting YAML edits.</w:t>
+      </w:r>
+    </w:p>
+    <w:p>
+      <w:pPr>
+        <w:pStyle w:val="Heading2"/>
+        <w:rPr>
+          <w:rFonts w:ascii="Calibri" w:hAnsi="Calibri"/>
+        </w:rPr>
+      </w:pPr>
+      <w:r>
+        <w:rPr/>
+        <w:t>Exercise 2 - Inspect event contracts</w:t>
+      </w:r>
+    </w:p>
+    <w:p>
+      <w:pPr>
+        <w:pStyle w:val="Normal"/>
+        <w:rPr>
+          <w:rFonts w:ascii="Calibri" w:hAnsi="Calibri"/>
+        </w:rPr>
+      </w:pPr>
+      <w:r>
+        <w:rPr>
+          <w:rFonts w:ascii="Calibri" w:hAnsi="Calibri"/>
+          <w:b/>
+        </w:rPr>
+        <w:t xml:space="preserve">Objective: </w:t>
+      </w:r>
+      <w:r>
+        <w:rPr>
+          <w:rFonts w:ascii="Calibri" w:hAnsi="Calibri"/>
+        </w:rPr>
+        <w:t>Read the CDC, clickstream, logistics, and schema proposal inputs before processing them.</w:t>
+      </w:r>
+    </w:p>
+    <w:p>
+      <w:pPr>
+        <w:pStyle w:val="Normal"/>
+        <w:rPr>
+          <w:rFonts w:ascii="Calibri" w:hAnsi="Calibri"/>
+        </w:rPr>
+      </w:pPr>
+      <w:r>
+        <w:rPr>
+          <w:rFonts w:ascii="Calibri" w:hAnsi="Calibri"/>
+          <w:b/>
+        </w:rPr>
+        <w:t xml:space="preserve">Explanation: </w:t>
+      </w:r>
+      <w:r>
+        <w:rPr>
+          <w:rFonts w:ascii="Calibri" w:hAnsi="Calibri"/>
+        </w:rPr>
+        <w:t>Day 5 is about ingestion design. Before writing transformations, identify keys, payload fields, event time, source metadata, and fields used for validation.</w:t>
+      </w:r>
+    </w:p>
+    <w:p>
+      <w:pPr>
+        <w:pStyle w:val="Normal"/>
+        <w:rPr>
+          <w:rFonts w:ascii="Calibri" w:hAnsi="Calibri"/>
+        </w:rPr>
+      </w:pPr>
+      <w:r>
+        <w:rPr>
+          <w:rFonts w:ascii="Calibri" w:hAnsi="Calibri"/>
+        </w:rPr>
+        <w:t>Commands:</w:t>
       </w:r>
     </w:p>
     <w:p>
@@ -1612,141 +1775,7 @@
           <w:color w:val="263242"/>
           <w:sz w:val="18"/>
         </w:rPr>
-        <w:t>python run_day5_lab_tests.py</w:t>
-      </w:r>
-    </w:p>
-    <w:p>
-      <w:pPr>
-        <w:pStyle w:val="Normal"/>
-        <w:ind w:start="360"/>
-        <w:rPr>
-          <w:rFonts w:ascii="Calibri" w:hAnsi="Calibri"/>
-        </w:rPr>
-      </w:pPr>
-      <w:r>
-        <w:rPr>
-          <w:rFonts w:ascii="Calibri" w:hAnsi="Calibri"/>
-          <w:b/>
-        </w:rPr>
-        <w:t xml:space="preserve">Expected output: </w:t>
-      </w:r>
-      <w:r>
-        <w:rPr>
-          <w:rFonts w:ascii="Calibri" w:hAnsi="Calibri"/>
-        </w:rPr>
-        <w:t>The proof runner prints PASS lines for Bronze events, duplicate quarantine, DLQ records, Gold KPIs, schema decisions, and docker compose config.</w:t>
-      </w:r>
-    </w:p>
-    <w:p>
-      <w:pPr>
-        <w:pStyle w:val="Normal"/>
-        <w:rPr>
-          <w:rFonts w:ascii="Calibri" w:hAnsi="Calibri"/>
-        </w:rPr>
-      </w:pPr>
-      <w:r>
-        <w:rPr>
-          <w:rFonts w:ascii="Calibri" w:hAnsi="Calibri"/>
-          <w:b/>
-        </w:rPr>
-        <w:t xml:space="preserve">Mini exercise: </w:t>
-      </w:r>
-      <w:r>
-        <w:rPr>
-          <w:rFonts w:ascii="Calibri" w:hAnsi="Calibri"/>
-        </w:rPr>
-        <w:t>Which command proves the Docker Compose file is valid without starting Kafka?</w:t>
-      </w:r>
-    </w:p>
-    <w:p>
-      <w:pPr>
-        <w:pStyle w:val="Normal"/>
-        <w:rPr>
-          <w:rFonts w:ascii="Calibri" w:hAnsi="Calibri"/>
-        </w:rPr>
-      </w:pPr>
-      <w:r>
-        <w:rPr>
-          <w:rFonts w:ascii="Calibri" w:hAnsi="Calibri"/>
-          <w:b/>
-        </w:rPr>
-        <w:t xml:space="preserve">Solution: </w:t>
-      </w:r>
-      <w:r>
-        <w:rPr>
-          <w:rFonts w:ascii="Calibri" w:hAnsi="Calibri"/>
-        </w:rPr>
-        <w:t>docker compose config. The proof runner already executes it, but running it directly is useful when troubleshooting YAML edits.</w:t>
-      </w:r>
-    </w:p>
-    <w:p>
-      <w:pPr>
-        <w:pStyle w:val="Heading2"/>
-        <w:rPr>
-          <w:rFonts w:ascii="Calibri" w:hAnsi="Calibri"/>
-        </w:rPr>
-      </w:pPr>
-      <w:r>
-        <w:rPr>
-          <w:rFonts w:ascii="Calibri" w:hAnsi="Calibri"/>
-        </w:rPr>
-        <w:t>Exercise 2 - Inspect event contracts</w:t>
-      </w:r>
-    </w:p>
-    <w:p>
-      <w:pPr>
-        <w:pStyle w:val="Normal"/>
-        <w:rPr>
-          <w:rFonts w:ascii="Calibri" w:hAnsi="Calibri"/>
-        </w:rPr>
-      </w:pPr>
-      <w:r>
-        <w:rPr>
-          <w:rFonts w:ascii="Calibri" w:hAnsi="Calibri"/>
-          <w:b/>
-        </w:rPr>
-        <w:t xml:space="preserve">Objective: </w:t>
-      </w:r>
-      <w:r>
-        <w:rPr>
-          <w:rFonts w:ascii="Calibri" w:hAnsi="Calibri"/>
-        </w:rPr>
-        <w:t>Read the CDC, clickstream, logistics, and schema proposal inputs before processing them.</w:t>
-      </w:r>
-    </w:p>
-    <w:p>
-      <w:pPr>
-        <w:pStyle w:val="Normal"/>
-        <w:rPr>
-          <w:rFonts w:ascii="Calibri" w:hAnsi="Calibri"/>
-        </w:rPr>
-      </w:pPr>
-      <w:r>
-        <w:rPr>
-          <w:rFonts w:ascii="Calibri" w:hAnsi="Calibri"/>
-          <w:b/>
-        </w:rPr>
-        <w:t xml:space="preserve">Explanation: </w:t>
-      </w:r>
-      <w:r>
-        <w:rPr>
-          <w:rFonts w:ascii="Calibri" w:hAnsi="Calibri"/>
-        </w:rPr>
-        <w:t>Day 5 is about ingestion design. Before writing transformations, identify keys, payload fields, event time, source metadata, and fields used for validation.</w:t>
-      </w:r>
-    </w:p>
-    <w:p>
-      <w:pPr>
-        <w:pStyle w:val="Normal"/>
-        <w:rPr>
-          <w:rFonts w:ascii="Calibri" w:hAnsi="Calibri"/>
-        </w:rPr>
-      </w:pPr>
-      <w:r>
-        <w:rPr>
-          <w:rFonts w:ascii="Calibri" w:hAnsi="Calibri"/>
-        </w:rPr>
-        <w:t>Commands:</w:t>
+        <w:t>d</w:t>
       </w:r>
     </w:p>
     <w:p>
@@ -1761,10 +1790,140 @@
       <w:r>
         <w:rPr>
           <w:rFonts w:ascii="Calibri" w:hAnsi="Calibri"/>
-          <w:color w:val="263242"/>
-          <w:sz w:val="18"/>
-        </w:rPr>
-        <w:t>python -m json.tool input/schema_change_proposals.json</w:t>
+        </w:rPr>
+        <w:t>python -m json.tool input/orders_cdc.json</w:t>
+      </w:r>
+    </w:p>
+    <w:p>
+      <w:pPr>
+        <w:pStyle w:val="Normal"/>
+        <w:ind w:start="360"/>
+        <w:rPr>
+          <w:rFonts w:ascii="Calibri" w:hAnsi="Calibri"/>
+        </w:rPr>
+      </w:pPr>
+      <w:r>
+        <w:rPr>
+          <w:rFonts w:ascii="Calibri" w:hAnsi="Calibri"/>
+          <w:b/>
+        </w:rPr>
+        <w:t xml:space="preserve">Expected output: </w:t>
+      </w:r>
+      <w:r>
+        <w:rPr>
+          <w:rFonts w:ascii="Calibri" w:hAnsi="Calibri"/>
+        </w:rPr>
+        <w:t>The CDC records include event_id, op, order_id, source_lsn, and order_ts. Schema proposals show ACCEPT/REJECT style decisions.</w:t>
+      </w:r>
+    </w:p>
+    <w:p>
+      <w:pPr>
+        <w:pStyle w:val="Normal"/>
+        <w:rPr>
+          <w:rFonts w:ascii="Calibri" w:hAnsi="Calibri"/>
+        </w:rPr>
+      </w:pPr>
+      <w:r>
+        <w:rPr>
+          <w:rFonts w:ascii="Calibri" w:hAnsi="Calibri"/>
+          <w:b/>
+        </w:rPr>
+        <w:t xml:space="preserve">Mini exercise: </w:t>
+      </w:r>
+      <w:r>
+        <w:rPr>
+          <w:rFonts w:ascii="Calibri" w:hAnsi="Calibri"/>
+        </w:rPr>
+        <w:t>Fill in the blank: For order events, the partition key should usually be ____.</w:t>
+      </w:r>
+    </w:p>
+    <w:p>
+      <w:pPr>
+        <w:pStyle w:val="Normal"/>
+        <w:rPr>
+          <w:rFonts w:ascii="Calibri" w:hAnsi="Calibri"/>
+        </w:rPr>
+      </w:pPr>
+      <w:r>
+        <w:rPr>
+          <w:rFonts w:ascii="Calibri" w:hAnsi="Calibri"/>
+          <w:b/>
+        </w:rPr>
+        <w:t xml:space="preserve">Solution: </w:t>
+      </w:r>
+      <w:r>
+        <w:rPr>
+          <w:rFonts w:ascii="Calibri" w:hAnsi="Calibri"/>
+        </w:rPr>
+        <w:t>order_id. It keeps events for one order together so consumers can apply updates in order.</w:t>
+      </w:r>
+    </w:p>
+    <w:p>
+      <w:pPr>
+        <w:pStyle w:val="Heading2"/>
+        <w:rPr>
+          <w:rFonts w:ascii="Calibri" w:hAnsi="Calibri"/>
+        </w:rPr>
+      </w:pPr>
+      <w:r>
+        <w:rPr/>
+        <w:t>Exercise 3 - Load Bronze without changing source fidelity</w:t>
+      </w:r>
+    </w:p>
+    <w:p>
+      <w:pPr>
+        <w:pStyle w:val="Normal"/>
+        <w:rPr>
+          <w:rFonts w:ascii="Calibri" w:hAnsi="Calibri"/>
+        </w:rPr>
+      </w:pPr>
+      <w:r>
+        <w:rPr>
+          <w:rFonts w:ascii="Calibri" w:hAnsi="Calibri"/>
+          <w:b/>
+        </w:rPr>
+        <w:t xml:space="preserve">Objective: </w:t>
+      </w:r>
+      <w:r>
+        <w:rPr>
+          <w:rFonts w:ascii="Calibri" w:hAnsi="Calibri"/>
+        </w:rPr>
+        <w:t>Create raw Bronze files with ingestion metadata and record hashes.</w:t>
+      </w:r>
+    </w:p>
+    <w:p>
+      <w:pPr>
+        <w:pStyle w:val="Normal"/>
+        <w:rPr>
+          <w:rFonts w:ascii="Calibri" w:hAnsi="Calibri"/>
+        </w:rPr>
+      </w:pPr>
+      <w:r>
+        <w:rPr>
+          <w:rFonts w:ascii="Calibri" w:hAnsi="Calibri"/>
+          <w:b/>
+        </w:rPr>
+        <w:t xml:space="preserve">Explanation: </w:t>
+      </w:r>
+      <w:r>
+        <w:rPr>
+          <w:rFonts w:ascii="Calibri" w:hAnsi="Calibri"/>
+        </w:rPr>
+        <w:t>Bronze keeps raw data append-friendly and replayable. It should add metadata without hiding malformed or duplicate source records.</w:t>
+      </w:r>
+    </w:p>
+    <w:p>
+      <w:pPr>
+        <w:pStyle w:val="Normal"/>
+        <w:rPr>
+          <w:rFonts w:ascii="Calibri" w:hAnsi="Calibri"/>
+        </w:rPr>
+      </w:pPr>
+      <w:r>
+        <w:rPr>
+          <w:rFonts w:ascii="Calibri" w:hAnsi="Calibri"/>
+        </w:rPr>
+        <w:t>Commands:</w:t>
       </w:r>
     </w:p>
     <w:p>
@@ -1779,142 +1938,10 @@
       <w:r>
         <w:rPr>
           <w:rFonts w:ascii="Calibri" w:hAnsi="Calibri"/>
-        </w:rPr>
-        <w:t>python -m json.tool input/orders_cdc.json</w:t>
-      </w:r>
-    </w:p>
-    <w:p>
-      <w:pPr>
-        <w:pStyle w:val="Normal"/>
-        <w:ind w:start="360"/>
-        <w:rPr>
-          <w:rFonts w:ascii="Calibri" w:hAnsi="Calibri"/>
-        </w:rPr>
-      </w:pPr>
-      <w:r>
-        <w:rPr>
-          <w:rFonts w:ascii="Calibri" w:hAnsi="Calibri"/>
-          <w:b/>
-        </w:rPr>
-        <w:t xml:space="preserve">Expected output: </w:t>
-      </w:r>
-      <w:r>
-        <w:rPr>
-          <w:rFonts w:ascii="Calibri" w:hAnsi="Calibri"/>
-        </w:rPr>
-        <w:t>The CDC records include event_id, op, order_id, source_lsn, and order_ts. Schema proposals show ACCEPT/REJECT style decisions.</w:t>
-      </w:r>
-    </w:p>
-    <w:p>
-      <w:pPr>
-        <w:pStyle w:val="Normal"/>
-        <w:rPr>
-          <w:rFonts w:ascii="Calibri" w:hAnsi="Calibri"/>
-        </w:rPr>
-      </w:pPr>
-      <w:r>
-        <w:rPr>
-          <w:rFonts w:ascii="Calibri" w:hAnsi="Calibri"/>
-          <w:b/>
-        </w:rPr>
-        <w:t xml:space="preserve">Mini exercise: </w:t>
-      </w:r>
-      <w:r>
-        <w:rPr>
-          <w:rFonts w:ascii="Calibri" w:hAnsi="Calibri"/>
-        </w:rPr>
-        <w:t>Fill in the blank: For order events, the partition key should usually be ____.</w:t>
-      </w:r>
-    </w:p>
-    <w:p>
-      <w:pPr>
-        <w:pStyle w:val="Normal"/>
-        <w:rPr>
-          <w:rFonts w:ascii="Calibri" w:hAnsi="Calibri"/>
-        </w:rPr>
-      </w:pPr>
-      <w:r>
-        <w:rPr>
-          <w:rFonts w:ascii="Calibri" w:hAnsi="Calibri"/>
-          <w:b/>
-        </w:rPr>
-        <w:t xml:space="preserve">Solution: </w:t>
-      </w:r>
-      <w:r>
-        <w:rPr>
-          <w:rFonts w:ascii="Calibri" w:hAnsi="Calibri"/>
-        </w:rPr>
-        <w:t>order_id. It keeps events for one order together so consumers can apply updates in order.</w:t>
-      </w:r>
-    </w:p>
-    <w:p>
-      <w:pPr>
-        <w:pStyle w:val="Heading2"/>
-        <w:rPr>
-          <w:rFonts w:ascii="Calibri" w:hAnsi="Calibri"/>
-        </w:rPr>
-      </w:pPr>
-      <w:r>
-        <w:rPr>
-          <w:rFonts w:ascii="Calibri" w:hAnsi="Calibri"/>
-        </w:rPr>
-        <w:t>Exercise 3 - Load Bronze without changing source fidelity</w:t>
-      </w:r>
-    </w:p>
-    <w:p>
-      <w:pPr>
-        <w:pStyle w:val="Normal"/>
-        <w:rPr>
-          <w:rFonts w:ascii="Calibri" w:hAnsi="Calibri"/>
-        </w:rPr>
-      </w:pPr>
-      <w:r>
-        <w:rPr>
-          <w:rFonts w:ascii="Calibri" w:hAnsi="Calibri"/>
-          <w:b/>
-        </w:rPr>
-        <w:t xml:space="preserve">Objective: </w:t>
-      </w:r>
-      <w:r>
-        <w:rPr>
-          <w:rFonts w:ascii="Calibri" w:hAnsi="Calibri"/>
-        </w:rPr>
-        <w:t>Create raw Bronze files with ingestion metadata and record hashes.</w:t>
-      </w:r>
-    </w:p>
-    <w:p>
-      <w:pPr>
-        <w:pStyle w:val="Normal"/>
-        <w:rPr>
-          <w:rFonts w:ascii="Calibri" w:hAnsi="Calibri"/>
-        </w:rPr>
-      </w:pPr>
-      <w:r>
-        <w:rPr>
-          <w:rFonts w:ascii="Calibri" w:hAnsi="Calibri"/>
-          <w:b/>
-        </w:rPr>
-        <w:t xml:space="preserve">Explanation: </w:t>
-      </w:r>
-      <w:r>
-        <w:rPr>
-          <w:rFonts w:ascii="Calibri" w:hAnsi="Calibri"/>
-        </w:rPr>
-        <w:t>Bronze keeps raw data append-friendly and replayable. It should add metadata without hiding malformed or duplicate source records.</w:t>
-      </w:r>
-    </w:p>
-    <w:p>
-      <w:pPr>
-        <w:pStyle w:val="Normal"/>
-        <w:rPr>
-          <w:rFonts w:ascii="Calibri" w:hAnsi="Calibri"/>
-        </w:rPr>
-      </w:pPr>
-      <w:r>
-        <w:rPr>
-          <w:rFonts w:ascii="Calibri" w:hAnsi="Calibri"/>
-        </w:rPr>
-        <w:t>Commands:</w:t>
+          <w:color w:val="263242"/>
+          <w:sz w:val="18"/>
+        </w:rPr>
+        <w:t>python medallion_pipeline.py bronze</w:t>
       </w:r>
     </w:p>
     <w:p>
@@ -1929,10 +1956,140 @@
       <w:r>
         <w:rPr>
           <w:rFonts w:ascii="Calibri" w:hAnsi="Calibri"/>
-          <w:color w:val="263242"/>
-          <w:sz w:val="18"/>
-        </w:rPr>
-        <w:t>python medallion_pipeline.py bronze</w:t>
+        </w:rPr>
+        <w:t>python -m json.tool outputs/bronze/orders_cdc.json</w:t>
+      </w:r>
+    </w:p>
+    <w:p>
+      <w:pPr>
+        <w:pStyle w:val="Normal"/>
+        <w:ind w:start="360"/>
+        <w:rPr>
+          <w:rFonts w:ascii="Calibri" w:hAnsi="Calibri"/>
+        </w:rPr>
+      </w:pPr>
+      <w:r>
+        <w:rPr>
+          <w:rFonts w:ascii="Calibri" w:hAnsi="Calibri"/>
+          <w:b/>
+        </w:rPr>
+        <w:t xml:space="preserve">Expected output: </w:t>
+      </w:r>
+      <w:r>
+        <w:rPr>
+          <w:rFonts w:ascii="Calibri" w:hAnsi="Calibri"/>
+        </w:rPr>
+        <w:t>orders_bronze=7, clickstream_bronze=4, logistics_bronze=4, and Bronze rows include _bronze_loaded_at plus _record_hash.</w:t>
+      </w:r>
+    </w:p>
+    <w:p>
+      <w:pPr>
+        <w:pStyle w:val="Normal"/>
+        <w:rPr>
+          <w:rFonts w:ascii="Calibri" w:hAnsi="Calibri"/>
+        </w:rPr>
+      </w:pPr>
+      <w:r>
+        <w:rPr>
+          <w:rFonts w:ascii="Calibri" w:hAnsi="Calibri"/>
+          <w:b/>
+        </w:rPr>
+        <w:t xml:space="preserve">Mini exercise: </w:t>
+      </w:r>
+      <w:r>
+        <w:rPr>
+          <w:rFonts w:ascii="Calibri" w:hAnsi="Calibri"/>
+        </w:rPr>
+        <w:t>Why should the missing shipment_id row still land in Bronze?</w:t>
+      </w:r>
+    </w:p>
+    <w:p>
+      <w:pPr>
+        <w:pStyle w:val="Normal"/>
+        <w:rPr>
+          <w:rFonts w:ascii="Calibri" w:hAnsi="Calibri"/>
+        </w:rPr>
+      </w:pPr>
+      <w:r>
+        <w:rPr>
+          <w:rFonts w:ascii="Calibri" w:hAnsi="Calibri"/>
+          <w:b/>
+        </w:rPr>
+        <w:t xml:space="preserve">Solution: </w:t>
+      </w:r>
+      <w:r>
+        <w:rPr>
+          <w:rFonts w:ascii="Calibri" w:hAnsi="Calibri"/>
+        </w:rPr>
+        <w:t>Bronze is the audit/replay layer. Rejecting the row too early would erase evidence needed to fix or replay the source batch.</w:t>
+      </w:r>
+    </w:p>
+    <w:p>
+      <w:pPr>
+        <w:pStyle w:val="Heading2"/>
+        <w:rPr>
+          <w:rFonts w:ascii="Calibri" w:hAnsi="Calibri"/>
+        </w:rPr>
+      </w:pPr>
+      <w:r>
+        <w:rPr/>
+        <w:t>Exercise 4 - Build Silver current-state orders</w:t>
+      </w:r>
+    </w:p>
+    <w:p>
+      <w:pPr>
+        <w:pStyle w:val="Normal"/>
+        <w:rPr>
+          <w:rFonts w:ascii="Calibri" w:hAnsi="Calibri"/>
+        </w:rPr>
+      </w:pPr>
+      <w:r>
+        <w:rPr>
+          <w:rFonts w:ascii="Calibri" w:hAnsi="Calibri"/>
+          <w:b/>
+        </w:rPr>
+        <w:t xml:space="preserve">Objective: </w:t>
+      </w:r>
+      <w:r>
+        <w:rPr>
+          <w:rFonts w:ascii="Calibri" w:hAnsi="Calibri"/>
+        </w:rPr>
+        <w:t>Deduplicate CDC events and materialize the latest non-deleted order state.</w:t>
+      </w:r>
+    </w:p>
+    <w:p>
+      <w:pPr>
+        <w:pStyle w:val="Normal"/>
+        <w:rPr>
+          <w:rFonts w:ascii="Calibri" w:hAnsi="Calibri"/>
+        </w:rPr>
+      </w:pPr>
+      <w:r>
+        <w:rPr>
+          <w:rFonts w:ascii="Calibri" w:hAnsi="Calibri"/>
+          <w:b/>
+        </w:rPr>
+        <w:t xml:space="preserve">Explanation: </w:t>
+      </w:r>
+      <w:r>
+        <w:rPr>
+          <w:rFonts w:ascii="Calibri" w:hAnsi="Calibri"/>
+        </w:rPr>
+        <w:t>Silver turns raw CDC events into trustworthy working data. The duplicate event_id is quarantined, delete events remove current state, and source_lsn controls ordering.</w:t>
+      </w:r>
+    </w:p>
+    <w:p>
+      <w:pPr>
+        <w:pStyle w:val="Normal"/>
+        <w:rPr>
+          <w:rFonts w:ascii="Calibri" w:hAnsi="Calibri"/>
+        </w:rPr>
+      </w:pPr>
+      <w:r>
+        <w:rPr>
+          <w:rFonts w:ascii="Calibri" w:hAnsi="Calibri"/>
+        </w:rPr>
+        <w:t>Commands:</w:t>
       </w:r>
     </w:p>
     <w:p>
@@ -1947,142 +2104,10 @@
       <w:r>
         <w:rPr>
           <w:rFonts w:ascii="Calibri" w:hAnsi="Calibri"/>
-        </w:rPr>
-        <w:t>python -m json.tool outputs/bronze/orders_cdc.json</w:t>
-      </w:r>
-    </w:p>
-    <w:p>
-      <w:pPr>
-        <w:pStyle w:val="Normal"/>
-        <w:ind w:start="360"/>
-        <w:rPr>
-          <w:rFonts w:ascii="Calibri" w:hAnsi="Calibri"/>
-        </w:rPr>
-      </w:pPr>
-      <w:r>
-        <w:rPr>
-          <w:rFonts w:ascii="Calibri" w:hAnsi="Calibri"/>
-          <w:b/>
-        </w:rPr>
-        <w:t xml:space="preserve">Expected output: </w:t>
-      </w:r>
-      <w:r>
-        <w:rPr>
-          <w:rFonts w:ascii="Calibri" w:hAnsi="Calibri"/>
-        </w:rPr>
-        <w:t>orders_bronze=7, clickstream_bronze=4, logistics_bronze=4, and Bronze rows include _bronze_loaded_at plus _record_hash.</w:t>
-      </w:r>
-    </w:p>
-    <w:p>
-      <w:pPr>
-        <w:pStyle w:val="Normal"/>
-        <w:rPr>
-          <w:rFonts w:ascii="Calibri" w:hAnsi="Calibri"/>
-        </w:rPr>
-      </w:pPr>
-      <w:r>
-        <w:rPr>
-          <w:rFonts w:ascii="Calibri" w:hAnsi="Calibri"/>
-          <w:b/>
-        </w:rPr>
-        <w:t xml:space="preserve">Mini exercise: </w:t>
-      </w:r>
-      <w:r>
-        <w:rPr>
-          <w:rFonts w:ascii="Calibri" w:hAnsi="Calibri"/>
-        </w:rPr>
-        <w:t>Why should the missing shipment_id row still land in Bronze?</w:t>
-      </w:r>
-    </w:p>
-    <w:p>
-      <w:pPr>
-        <w:pStyle w:val="Normal"/>
-        <w:rPr>
-          <w:rFonts w:ascii="Calibri" w:hAnsi="Calibri"/>
-        </w:rPr>
-      </w:pPr>
-      <w:r>
-        <w:rPr>
-          <w:rFonts w:ascii="Calibri" w:hAnsi="Calibri"/>
-          <w:b/>
-        </w:rPr>
-        <w:t xml:space="preserve">Solution: </w:t>
-      </w:r>
-      <w:r>
-        <w:rPr>
-          <w:rFonts w:ascii="Calibri" w:hAnsi="Calibri"/>
-        </w:rPr>
-        <w:t>Bronze is the audit/replay layer. Rejecting the row too early would erase evidence needed to fix or replay the source batch.</w:t>
-      </w:r>
-    </w:p>
-    <w:p>
-      <w:pPr>
-        <w:pStyle w:val="Heading2"/>
-        <w:rPr>
-          <w:rFonts w:ascii="Calibri" w:hAnsi="Calibri"/>
-        </w:rPr>
-      </w:pPr>
-      <w:r>
-        <w:rPr>
-          <w:rFonts w:ascii="Calibri" w:hAnsi="Calibri"/>
-        </w:rPr>
-        <w:t>Exercise 4 - Build Silver current-state orders</w:t>
-      </w:r>
-    </w:p>
-    <w:p>
-      <w:pPr>
-        <w:pStyle w:val="Normal"/>
-        <w:rPr>
-          <w:rFonts w:ascii="Calibri" w:hAnsi="Calibri"/>
-        </w:rPr>
-      </w:pPr>
-      <w:r>
-        <w:rPr>
-          <w:rFonts w:ascii="Calibri" w:hAnsi="Calibri"/>
-          <w:b/>
-        </w:rPr>
-        <w:t xml:space="preserve">Objective: </w:t>
-      </w:r>
-      <w:r>
-        <w:rPr>
-          <w:rFonts w:ascii="Calibri" w:hAnsi="Calibri"/>
-        </w:rPr>
-        <w:t>Deduplicate CDC events and materialize the latest non-deleted order state.</w:t>
-      </w:r>
-    </w:p>
-    <w:p>
-      <w:pPr>
-        <w:pStyle w:val="Normal"/>
-        <w:rPr>
-          <w:rFonts w:ascii="Calibri" w:hAnsi="Calibri"/>
-        </w:rPr>
-      </w:pPr>
-      <w:r>
-        <w:rPr>
-          <w:rFonts w:ascii="Calibri" w:hAnsi="Calibri"/>
-          <w:b/>
-        </w:rPr>
-        <w:t xml:space="preserve">Explanation: </w:t>
-      </w:r>
-      <w:r>
-        <w:rPr>
-          <w:rFonts w:ascii="Calibri" w:hAnsi="Calibri"/>
-        </w:rPr>
-        <w:t>Silver turns raw CDC events into trustworthy working data. The duplicate event_id is quarantined, delete events remove current state, and source_lsn controls ordering.</w:t>
-      </w:r>
-    </w:p>
-    <w:p>
-      <w:pPr>
-        <w:pStyle w:val="Normal"/>
-        <w:rPr>
-          <w:rFonts w:ascii="Calibri" w:hAnsi="Calibri"/>
-        </w:rPr>
-      </w:pPr>
-      <w:r>
-        <w:rPr>
-          <w:rFonts w:ascii="Calibri" w:hAnsi="Calibri"/>
-        </w:rPr>
-        <w:t>Commands:</w:t>
+          <w:color w:val="263242"/>
+          <w:sz w:val="18"/>
+        </w:rPr>
+        <w:t>python medallion_pipeline.py all</w:t>
       </w:r>
     </w:p>
     <w:p>
@@ -2100,7 +2125,132 @@
           <w:color w:val="263242"/>
           <w:sz w:val="18"/>
         </w:rPr>
-        <w:t>python medallion_pipeline.py all</w:t>
+        <w:t>python -c "import csv; print(list(csv.DictReader(open('outputs/silver/orders_current.csv'))))"</w:t>
+      </w:r>
+    </w:p>
+    <w:p>
+      <w:pPr>
+        <w:pStyle w:val="Normal"/>
+        <w:ind w:start="360"/>
+        <w:rPr>
+          <w:rFonts w:ascii="Calibri" w:hAnsi="Calibri"/>
+        </w:rPr>
+      </w:pPr>
+      <w:r>
+        <w:rPr>
+          <w:rFonts w:ascii="Calibri" w:hAnsi="Calibri"/>
+        </w:rPr>
+        <w:t>Expected output: Two current orders remain: 1001 SHIPPED and 1002 PAID. One duplicate event is written to outputs/quarantine/duplicate_events.json.</w:t>
+      </w:r>
+    </w:p>
+    <w:p>
+      <w:pPr>
+        <w:pStyle w:val="Normal"/>
+        <w:rPr>
+          <w:rFonts w:ascii="Calibri" w:hAnsi="Calibri"/>
+        </w:rPr>
+      </w:pPr>
+      <w:r>
+        <w:rPr>
+          <w:rFonts w:ascii="Calibri" w:hAnsi="Calibri"/>
+          <w:b/>
+        </w:rPr>
+        <w:t xml:space="preserve">Mini exercise: </w:t>
+      </w:r>
+      <w:r>
+        <w:rPr>
+          <w:rFonts w:ascii="Calibri" w:hAnsi="Calibri"/>
+        </w:rPr>
+        <w:t>Match the field to its purpose: event_id, source_lsn, op.</w:t>
+      </w:r>
+    </w:p>
+    <w:p>
+      <w:pPr>
+        <w:pStyle w:val="Normal"/>
+        <w:rPr>
+          <w:rFonts w:ascii="Calibri" w:hAnsi="Calibri"/>
+        </w:rPr>
+      </w:pPr>
+      <w:r>
+        <w:rPr>
+          <w:rFonts w:ascii="Calibri" w:hAnsi="Calibri"/>
+          <w:b/>
+        </w:rPr>
+        <w:t xml:space="preserve">Solution: </w:t>
+      </w:r>
+      <w:r>
+        <w:rPr>
+          <w:rFonts w:ascii="Calibri" w:hAnsi="Calibri"/>
+        </w:rPr>
+        <w:t>event_id = deduplication key; source_lsn = source ordering/watermark point; op = create/update/delete/read action.</w:t>
+      </w:r>
+    </w:p>
+    <w:p>
+      <w:pPr>
+        <w:pStyle w:val="Heading2"/>
+        <w:rPr>
+          <w:rFonts w:ascii="Calibri" w:hAnsi="Calibri"/>
+        </w:rPr>
+      </w:pPr>
+      <w:r>
+        <w:rPr/>
+        <w:t>Exercise 5 - Route logistics failures to a DLQ</w:t>
+      </w:r>
+    </w:p>
+    <w:p>
+      <w:pPr>
+        <w:pStyle w:val="Normal"/>
+        <w:rPr>
+          <w:rFonts w:ascii="Calibri" w:hAnsi="Calibri"/>
+        </w:rPr>
+      </w:pPr>
+      <w:r>
+        <w:rPr>
+          <w:rFonts w:ascii="Calibri" w:hAnsi="Calibri"/>
+          <w:b/>
+        </w:rPr>
+        <w:t xml:space="preserve">Objective: </w:t>
+      </w:r>
+      <w:r>
+        <w:rPr>
+          <w:rFonts w:ascii="Calibri" w:hAnsi="Calibri"/>
+        </w:rPr>
+        <w:t>Separate valid shipment records from malformed or referentially invalid records.</w:t>
+      </w:r>
+    </w:p>
+    <w:p>
+      <w:pPr>
+        <w:pStyle w:val="Normal"/>
+        <w:rPr>
+          <w:rFonts w:ascii="Calibri" w:hAnsi="Calibri"/>
+        </w:rPr>
+      </w:pPr>
+      <w:r>
+        <w:rPr>
+          <w:rFonts w:ascii="Calibri" w:hAnsi="Calibri"/>
+          <w:b/>
+        </w:rPr>
+        <w:t xml:space="preserve">Explanation: </w:t>
+      </w:r>
+      <w:r>
+        <w:rPr>
+          <w:rFonts w:ascii="Calibri" w:hAnsi="Calibri"/>
+        </w:rPr>
+        <w:t>The lab treats business validation failures as quarantine records. Valid rows continue; invalid rows carry error context and the original record.</w:t>
+      </w:r>
+    </w:p>
+    <w:p>
+      <w:pPr>
+        <w:pStyle w:val="Normal"/>
+        <w:rPr>
+          <w:rFonts w:ascii="Calibri" w:hAnsi="Calibri"/>
+        </w:rPr>
+      </w:pPr>
+      <w:r>
+        <w:rPr>
+          <w:rFonts w:ascii="Calibri" w:hAnsi="Calibri"/>
+        </w:rPr>
+        <w:t>Commands:</w:t>
       </w:r>
     </w:p>
     <w:p>
@@ -2118,134 +2268,7 @@
           <w:color w:val="263242"/>
           <w:sz w:val="18"/>
         </w:rPr>
-        <w:t>python -c "import csv; print(list(csv.DictReader(open('outputs/silver/orders_current.csv'))))"</w:t>
-      </w:r>
-    </w:p>
-    <w:p>
-      <w:pPr>
-        <w:pStyle w:val="Normal"/>
-        <w:ind w:start="360"/>
-        <w:rPr>
-          <w:rFonts w:ascii="Calibri" w:hAnsi="Calibri"/>
-        </w:rPr>
-      </w:pPr>
-      <w:r>
-        <w:rPr>
-          <w:rFonts w:ascii="Calibri" w:hAnsi="Calibri"/>
-        </w:rPr>
-        <w:t>Expected output: Two current orders remain: 1001 SHIPPED and 1002 PAID. One duplicate event is written to outputs/quarantine/duplicate_events.json.</w:t>
-      </w:r>
-    </w:p>
-    <w:p>
-      <w:pPr>
-        <w:pStyle w:val="Normal"/>
-        <w:rPr>
-          <w:rFonts w:ascii="Calibri" w:hAnsi="Calibri"/>
-        </w:rPr>
-      </w:pPr>
-      <w:r>
-        <w:rPr>
-          <w:rFonts w:ascii="Calibri" w:hAnsi="Calibri"/>
-          <w:b/>
-        </w:rPr>
-        <w:t xml:space="preserve">Mini exercise: </w:t>
-      </w:r>
-      <w:r>
-        <w:rPr>
-          <w:rFonts w:ascii="Calibri" w:hAnsi="Calibri"/>
-        </w:rPr>
-        <w:t>Match the field to its purpose: event_id, source_lsn, op.</w:t>
-      </w:r>
-    </w:p>
-    <w:p>
-      <w:pPr>
-        <w:pStyle w:val="Normal"/>
-        <w:rPr>
-          <w:rFonts w:ascii="Calibri" w:hAnsi="Calibri"/>
-        </w:rPr>
-      </w:pPr>
-      <w:r>
-        <w:rPr>
-          <w:rFonts w:ascii="Calibri" w:hAnsi="Calibri"/>
-          <w:b/>
-        </w:rPr>
-        <w:t xml:space="preserve">Solution: </w:t>
-      </w:r>
-      <w:r>
-        <w:rPr>
-          <w:rFonts w:ascii="Calibri" w:hAnsi="Calibri"/>
-        </w:rPr>
-        <w:t>event_id = deduplication key; source_lsn = source ordering/watermark point; op = create/update/delete/read action.</w:t>
-      </w:r>
-    </w:p>
-    <w:p>
-      <w:pPr>
-        <w:pStyle w:val="Heading2"/>
-        <w:rPr>
-          <w:rFonts w:ascii="Calibri" w:hAnsi="Calibri"/>
-        </w:rPr>
-      </w:pPr>
-      <w:r>
-        <w:rPr>
-          <w:rFonts w:ascii="Calibri" w:hAnsi="Calibri"/>
-        </w:rPr>
-        <w:t>Exercise 5 - Route logistics failures to a DLQ</w:t>
-      </w:r>
-    </w:p>
-    <w:p>
-      <w:pPr>
-        <w:pStyle w:val="Normal"/>
-        <w:rPr>
-          <w:rFonts w:ascii="Calibri" w:hAnsi="Calibri"/>
-        </w:rPr>
-      </w:pPr>
-      <w:r>
-        <w:rPr>
-          <w:rFonts w:ascii="Calibri" w:hAnsi="Calibri"/>
-          <w:b/>
-        </w:rPr>
-        <w:t xml:space="preserve">Objective: </w:t>
-      </w:r>
-      <w:r>
-        <w:rPr>
-          <w:rFonts w:ascii="Calibri" w:hAnsi="Calibri"/>
-        </w:rPr>
-        <w:t>Separate valid shipment records from malformed or referentially invalid records.</w:t>
-      </w:r>
-    </w:p>
-    <w:p>
-      <w:pPr>
-        <w:pStyle w:val="Normal"/>
-        <w:rPr>
-          <w:rFonts w:ascii="Calibri" w:hAnsi="Calibri"/>
-        </w:rPr>
-      </w:pPr>
-      <w:r>
-        <w:rPr>
-          <w:rFonts w:ascii="Calibri" w:hAnsi="Calibri"/>
-          <w:b/>
-        </w:rPr>
-        <w:t xml:space="preserve">Explanation: </w:t>
-      </w:r>
-      <w:r>
-        <w:rPr>
-          <w:rFonts w:ascii="Calibri" w:hAnsi="Calibri"/>
-        </w:rPr>
-        <w:t>The lab treats business validation failures as quarantine records. Valid rows continue; invalid rows carry error context and the original record.</w:t>
-      </w:r>
-    </w:p>
-    <w:p>
-      <w:pPr>
-        <w:pStyle w:val="Normal"/>
-        <w:rPr>
-          <w:rFonts w:ascii="Calibri" w:hAnsi="Calibri"/>
-        </w:rPr>
-      </w:pPr>
-      <w:r>
-        <w:rPr>
-          <w:rFonts w:ascii="Calibri" w:hAnsi="Calibri"/>
-        </w:rPr>
-        <w:t>Commands:</w:t>
+        <w:t>python medallion_pipeline.py all</w:t>
       </w:r>
     </w:p>
     <w:p>
@@ -2260,10 +2283,140 @@
       <w:r>
         <w:rPr>
           <w:rFonts w:ascii="Calibri" w:hAnsi="Calibri"/>
-          <w:color w:val="263242"/>
-          <w:sz w:val="18"/>
-        </w:rPr>
-        <w:t>python medallion_pipeline.py all</w:t>
+        </w:rPr>
+        <w:t>python -m json.tool outputs/quarantine/dlq_logistics.json</w:t>
+      </w:r>
+    </w:p>
+    <w:p>
+      <w:pPr>
+        <w:pStyle w:val="Normal"/>
+        <w:ind w:start="360"/>
+        <w:rPr>
+          <w:rFonts w:ascii="Calibri" w:hAnsi="Calibri"/>
+        </w:rPr>
+      </w:pPr>
+      <w:r>
+        <w:rPr>
+          <w:rFonts w:ascii="Calibri" w:hAnsi="Calibri"/>
+          <w:b/>
+        </w:rPr>
+        <w:t xml:space="preserve">Expected output: </w:t>
+      </w:r>
+      <w:r>
+        <w:rPr>
+          <w:rFonts w:ascii="Calibri" w:hAnsi="Calibri"/>
+        </w:rPr>
+        <w:t>Two DLQ records appear: one missing shipment_id and one unknown order_id.</w:t>
+      </w:r>
+    </w:p>
+    <w:p>
+      <w:pPr>
+        <w:pStyle w:val="Normal"/>
+        <w:rPr>
+          <w:rFonts w:ascii="Calibri" w:hAnsi="Calibri"/>
+        </w:rPr>
+      </w:pPr>
+      <w:r>
+        <w:rPr>
+          <w:rFonts w:ascii="Calibri" w:hAnsi="Calibri"/>
+          <w:b/>
+        </w:rPr>
+        <w:t xml:space="preserve">Mini exercise: </w:t>
+      </w:r>
+      <w:r>
+        <w:rPr>
+          <w:rFonts w:ascii="Calibri" w:hAnsi="Calibri"/>
+        </w:rPr>
+        <w:t>Should the unknown order_id row be silently dropped?</w:t>
+      </w:r>
+    </w:p>
+    <w:p>
+      <w:pPr>
+        <w:pStyle w:val="Normal"/>
+        <w:rPr>
+          <w:rFonts w:ascii="Calibri" w:hAnsi="Calibri"/>
+        </w:rPr>
+      </w:pPr>
+      <w:r>
+        <w:rPr>
+          <w:rFonts w:ascii="Calibri" w:hAnsi="Calibri"/>
+          <w:b/>
+        </w:rPr>
+        <w:t xml:space="preserve">Solution: </w:t>
+      </w:r>
+      <w:r>
+        <w:rPr>
+          <w:rFonts w:ascii="Calibri" w:hAnsi="Calibri"/>
+        </w:rPr>
+        <w:t>No. It should be quarantined with the reason so the source owner can correct the batch or the pipeline can replay after the order arrives.</w:t>
+      </w:r>
+    </w:p>
+    <w:p>
+      <w:pPr>
+        <w:pStyle w:val="Heading2"/>
+        <w:rPr>
+          <w:rFonts w:ascii="Calibri" w:hAnsi="Calibri"/>
+        </w:rPr>
+      </w:pPr>
+      <w:r>
+        <w:rPr/>
+        <w:t>Exercise 6 - Classify schema evolution proposals</w:t>
+      </w:r>
+    </w:p>
+    <w:p>
+      <w:pPr>
+        <w:pStyle w:val="Normal"/>
+        <w:rPr>
+          <w:rFonts w:ascii="Calibri" w:hAnsi="Calibri"/>
+        </w:rPr>
+      </w:pPr>
+      <w:r>
+        <w:rPr>
+          <w:rFonts w:ascii="Calibri" w:hAnsi="Calibri"/>
+          <w:b/>
+        </w:rPr>
+        <w:t xml:space="preserve">Objective: </w:t>
+      </w:r>
+      <w:r>
+        <w:rPr>
+          <w:rFonts w:ascii="Calibri" w:hAnsi="Calibri"/>
+        </w:rPr>
+        <w:t>Use compatibility thinking to decide which contract changes are safe.</w:t>
+      </w:r>
+    </w:p>
+    <w:p>
+      <w:pPr>
+        <w:pStyle w:val="Normal"/>
+        <w:rPr>
+          <w:rFonts w:ascii="Calibri" w:hAnsi="Calibri"/>
+        </w:rPr>
+      </w:pPr>
+      <w:r>
+        <w:rPr>
+          <w:rFonts w:ascii="Calibri" w:hAnsi="Calibri"/>
+          <w:b/>
+        </w:rPr>
+        <w:t xml:space="preserve">Explanation: </w:t>
+      </w:r>
+      <w:r>
+        <w:rPr>
+          <w:rFonts w:ascii="Calibri" w:hAnsi="Calibri"/>
+        </w:rPr>
+        <w:t>Schema evolution is a production guardrail. The lab stores a small decision file that mirrors the type of compatibility review teams do before changing event contracts.</w:t>
+      </w:r>
+    </w:p>
+    <w:p>
+      <w:pPr>
+        <w:pStyle w:val="Normal"/>
+        <w:rPr>
+          <w:rFonts w:ascii="Calibri" w:hAnsi="Calibri"/>
+        </w:rPr>
+      </w:pPr>
+      <w:r>
+        <w:rPr>
+          <w:rFonts w:ascii="Calibri" w:hAnsi="Calibri"/>
+        </w:rPr>
+        <w:t>Commands:</w:t>
       </w:r>
     </w:p>
     <w:p>
@@ -2278,142 +2431,10 @@
       <w:r>
         <w:rPr>
           <w:rFonts w:ascii="Calibri" w:hAnsi="Calibri"/>
-        </w:rPr>
-        <w:t>python -m json.tool outputs/quarantine/dlq_logistics.json</w:t>
-      </w:r>
-    </w:p>
-    <w:p>
-      <w:pPr>
-        <w:pStyle w:val="Normal"/>
-        <w:ind w:start="360"/>
-        <w:rPr>
-          <w:rFonts w:ascii="Calibri" w:hAnsi="Calibri"/>
-        </w:rPr>
-      </w:pPr>
-      <w:r>
-        <w:rPr>
-          <w:rFonts w:ascii="Calibri" w:hAnsi="Calibri"/>
-          <w:b/>
-        </w:rPr>
-        <w:t xml:space="preserve">Expected output: </w:t>
-      </w:r>
-      <w:r>
-        <w:rPr>
-          <w:rFonts w:ascii="Calibri" w:hAnsi="Calibri"/>
-        </w:rPr>
-        <w:t>Two DLQ records appear: one missing shipment_id and one unknown order_id.</w:t>
-      </w:r>
-    </w:p>
-    <w:p>
-      <w:pPr>
-        <w:pStyle w:val="Normal"/>
-        <w:rPr>
-          <w:rFonts w:ascii="Calibri" w:hAnsi="Calibri"/>
-        </w:rPr>
-      </w:pPr>
-      <w:r>
-        <w:rPr>
-          <w:rFonts w:ascii="Calibri" w:hAnsi="Calibri"/>
-          <w:b/>
-        </w:rPr>
-        <w:t xml:space="preserve">Mini exercise: </w:t>
-      </w:r>
-      <w:r>
-        <w:rPr>
-          <w:rFonts w:ascii="Calibri" w:hAnsi="Calibri"/>
-        </w:rPr>
-        <w:t>Should the unknown order_id row be silently dropped?</w:t>
-      </w:r>
-    </w:p>
-    <w:p>
-      <w:pPr>
-        <w:pStyle w:val="Normal"/>
-        <w:rPr>
-          <w:rFonts w:ascii="Calibri" w:hAnsi="Calibri"/>
-        </w:rPr>
-      </w:pPr>
-      <w:r>
-        <w:rPr>
-          <w:rFonts w:ascii="Calibri" w:hAnsi="Calibri"/>
-          <w:b/>
-        </w:rPr>
-        <w:t xml:space="preserve">Solution: </w:t>
-      </w:r>
-      <w:r>
-        <w:rPr>
-          <w:rFonts w:ascii="Calibri" w:hAnsi="Calibri"/>
-        </w:rPr>
-        <w:t>No. It should be quarantined with the reason so the source owner can correct the batch or the pipeline can replay after the order arrives.</w:t>
-      </w:r>
-    </w:p>
-    <w:p>
-      <w:pPr>
-        <w:pStyle w:val="Heading2"/>
-        <w:rPr>
-          <w:rFonts w:ascii="Calibri" w:hAnsi="Calibri"/>
-        </w:rPr>
-      </w:pPr>
-      <w:r>
-        <w:rPr>
-          <w:rFonts w:ascii="Calibri" w:hAnsi="Calibri"/>
-        </w:rPr>
-        <w:t>Exercise 6 - Classify schema evolution proposals</w:t>
-      </w:r>
-    </w:p>
-    <w:p>
-      <w:pPr>
-        <w:pStyle w:val="Normal"/>
-        <w:rPr>
-          <w:rFonts w:ascii="Calibri" w:hAnsi="Calibri"/>
-        </w:rPr>
-      </w:pPr>
-      <w:r>
-        <w:rPr>
-          <w:rFonts w:ascii="Calibri" w:hAnsi="Calibri"/>
-          <w:b/>
-        </w:rPr>
-        <w:t xml:space="preserve">Objective: </w:t>
-      </w:r>
-      <w:r>
-        <w:rPr>
-          <w:rFonts w:ascii="Calibri" w:hAnsi="Calibri"/>
-        </w:rPr>
-        <w:t>Use compatibility thinking to decide which contract changes are safe.</w:t>
-      </w:r>
-    </w:p>
-    <w:p>
-      <w:pPr>
-        <w:pStyle w:val="Normal"/>
-        <w:rPr>
-          <w:rFonts w:ascii="Calibri" w:hAnsi="Calibri"/>
-        </w:rPr>
-      </w:pPr>
-      <w:r>
-        <w:rPr>
-          <w:rFonts w:ascii="Calibri" w:hAnsi="Calibri"/>
-          <w:b/>
-        </w:rPr>
-        <w:t xml:space="preserve">Explanation: </w:t>
-      </w:r>
-      <w:r>
-        <w:rPr>
-          <w:rFonts w:ascii="Calibri" w:hAnsi="Calibri"/>
-        </w:rPr>
-        <w:t>Schema evolution is a production guardrail. The lab stores a small decision file that mirrors the type of compatibility review teams do before changing event contracts.</w:t>
-      </w:r>
-    </w:p>
-    <w:p>
-      <w:pPr>
-        <w:pStyle w:val="Normal"/>
-        <w:rPr>
-          <w:rFonts w:ascii="Calibri" w:hAnsi="Calibri"/>
-        </w:rPr>
-      </w:pPr>
-      <w:r>
-        <w:rPr>
-          <w:rFonts w:ascii="Calibri" w:hAnsi="Calibri"/>
-        </w:rPr>
-        <w:t>Commands:</w:t>
+          <w:color w:val="263242"/>
+          <w:sz w:val="18"/>
+        </w:rPr>
+        <w:t>python medallion_pipeline.py all</w:t>
       </w:r>
     </w:p>
     <w:p>
@@ -2431,7 +2452,139 @@
           <w:color w:val="263242"/>
           <w:sz w:val="18"/>
         </w:rPr>
-        <w:t>python medallion_pipeline.py all</w:t>
+        <w:t>python -m json.tool outputs/silver/schema_change_decisions.json</w:t>
+      </w:r>
+    </w:p>
+    <w:p>
+      <w:pPr>
+        <w:pStyle w:val="Normal"/>
+        <w:ind w:start="360"/>
+        <w:rPr>
+          <w:rFonts w:ascii="Calibri" w:hAnsi="Calibri"/>
+        </w:rPr>
+      </w:pPr>
+      <w:r>
+        <w:rPr>
+          <w:rFonts w:ascii="Calibri" w:hAnsi="Calibri"/>
+          <w:b/>
+        </w:rPr>
+        <w:t xml:space="preserve">Expected output: </w:t>
+      </w:r>
+      <w:r>
+        <w:rPr>
+          <w:rFonts w:ascii="Calibri" w:hAnsi="Calibri"/>
+        </w:rPr>
+        <w:t>The optional customer_tier addition is accepted, order_id rename is rejected, and optional coupon_code removal is accepted with a backward-focused policy.</w:t>
+      </w:r>
+    </w:p>
+    <w:p>
+      <w:pPr>
+        <w:pStyle w:val="Normal"/>
+        <w:rPr>
+          <w:rFonts w:ascii="Calibri" w:hAnsi="Calibri"/>
+        </w:rPr>
+      </w:pPr>
+      <w:r>
+        <w:rPr>
+          <w:rFonts w:ascii="Calibri" w:hAnsi="Calibri"/>
+          <w:b/>
+        </w:rPr>
+        <w:t xml:space="preserve">Mini exercise: </w:t>
+      </w:r>
+      <w:r>
+        <w:rPr>
+          <w:rFonts w:ascii="Calibri" w:hAnsi="Calibri"/>
+        </w:rPr>
+        <w:t>Multiple choice: Renaming order_id to id is safe because the meaning is the same. A) True B) False</w:t>
+      </w:r>
+    </w:p>
+    <w:p>
+      <w:pPr>
+        <w:pStyle w:val="Normal"/>
+        <w:rPr>
+          <w:rFonts w:ascii="Calibri" w:hAnsi="Calibri"/>
+        </w:rPr>
+      </w:pPr>
+      <w:r>
+        <w:rPr>
+          <w:rFonts w:ascii="Calibri" w:hAnsi="Calibri"/>
+          <w:b/>
+        </w:rPr>
+        <w:t xml:space="preserve">Solution: </w:t>
+      </w:r>
+      <w:r>
+        <w:rPr>
+          <w:rFonts w:ascii="Calibri" w:hAnsi="Calibri"/>
+        </w:rPr>
+        <w:t>B) False. Consumers read field names, not intentions. Use aliases or dual fields during a migration.</w:t>
+      </w:r>
+    </w:p>
+    <w:p>
+      <w:pPr>
+        <w:pStyle w:val="Heading2"/>
+        <w:rPr>
+          <w:rFonts w:ascii="Calibri" w:hAnsi="Calibri"/>
+        </w:rPr>
+      </w:pPr>
+      <w:r>
+        <w:rPr/>
+        <w:t>Exercise 7 - Create dimensions and facts</w:t>
+      </w:r>
+    </w:p>
+    <w:p>
+      <w:pPr>
+        <w:pStyle w:val="Normal"/>
+        <w:rPr>
+          <w:rFonts w:ascii="Calibri" w:hAnsi="Calibri"/>
+        </w:rPr>
+      </w:pPr>
+      <w:r>
+        <w:rPr>
+          <w:rFonts w:ascii="Calibri" w:hAnsi="Calibri"/>
+          <w:b/>
+        </w:rPr>
+        <w:t xml:space="preserve">Objective: </w:t>
+      </w:r>
+      <w:r>
+        <w:rPr>
+          <w:rFonts w:ascii="Calibri" w:hAnsi="Calibri"/>
+        </w:rPr>
+        <w:t>Build a customer dimension and order fact table from Silver records.</w:t>
+      </w:r>
+    </w:p>
+    <w:p>
+      <w:pPr>
+        <w:pStyle w:val="Normal"/>
+        <w:rPr>
+          <w:rFonts w:ascii="Calibri" w:hAnsi="Calibri"/>
+        </w:rPr>
+      </w:pPr>
+      <w:r>
+        <w:rPr>
+          <w:rFonts w:ascii="Calibri" w:hAnsi="Calibri"/>
+          <w:b/>
+        </w:rPr>
+        <w:t xml:space="preserve">Explanation: </w:t>
+      </w:r>
+      <w:r>
+        <w:rPr>
+          <w:rFonts w:ascii="Calibri" w:hAnsi="Calibri"/>
+        </w:rPr>
+        <w:t>Medallion pipelines often start dimensional modeling in Silver and serve aggregated views in Gold. This keeps BI logic consistent.</w:t>
+      </w:r>
+    </w:p>
+    <w:p>
+      <w:pPr>
+        <w:pStyle w:val="Normal"/>
+        <w:rPr>
+          <w:rFonts w:ascii="Calibri" w:hAnsi="Calibri"/>
+        </w:rPr>
+      </w:pPr>
+      <w:r>
+        <w:rPr>
+          <w:rFonts w:ascii="Calibri" w:hAnsi="Calibri"/>
+        </w:rPr>
+        <w:t>Commands:</w:t>
       </w:r>
     </w:p>
     <w:p>
@@ -2449,141 +2602,7 @@
           <w:color w:val="263242"/>
           <w:sz w:val="18"/>
         </w:rPr>
-        <w:t>python -m json.tool outputs/silver/schema_change_decisions.json</w:t>
-      </w:r>
-    </w:p>
-    <w:p>
-      <w:pPr>
-        <w:pStyle w:val="Normal"/>
-        <w:ind w:start="360"/>
-        <w:rPr>
-          <w:rFonts w:ascii="Calibri" w:hAnsi="Calibri"/>
-        </w:rPr>
-      </w:pPr>
-      <w:r>
-        <w:rPr>
-          <w:rFonts w:ascii="Calibri" w:hAnsi="Calibri"/>
-          <w:b/>
-        </w:rPr>
-        <w:t xml:space="preserve">Expected output: </w:t>
-      </w:r>
-      <w:r>
-        <w:rPr>
-          <w:rFonts w:ascii="Calibri" w:hAnsi="Calibri"/>
-        </w:rPr>
-        <w:t>The optional customer_tier addition is accepted, order_id rename is rejected, and optional coupon_code removal is accepted with a backward-focused policy.</w:t>
-      </w:r>
-    </w:p>
-    <w:p>
-      <w:pPr>
-        <w:pStyle w:val="Normal"/>
-        <w:rPr>
-          <w:rFonts w:ascii="Calibri" w:hAnsi="Calibri"/>
-        </w:rPr>
-      </w:pPr>
-      <w:r>
-        <w:rPr>
-          <w:rFonts w:ascii="Calibri" w:hAnsi="Calibri"/>
-          <w:b/>
-        </w:rPr>
-        <w:t xml:space="preserve">Mini exercise: </w:t>
-      </w:r>
-      <w:r>
-        <w:rPr>
-          <w:rFonts w:ascii="Calibri" w:hAnsi="Calibri"/>
-        </w:rPr>
-        <w:t>Multiple choice: Renaming order_id to id is safe because the meaning is the same. A) True B) False</w:t>
-      </w:r>
-    </w:p>
-    <w:p>
-      <w:pPr>
-        <w:pStyle w:val="Normal"/>
-        <w:rPr>
-          <w:rFonts w:ascii="Calibri" w:hAnsi="Calibri"/>
-        </w:rPr>
-      </w:pPr>
-      <w:r>
-        <w:rPr>
-          <w:rFonts w:ascii="Calibri" w:hAnsi="Calibri"/>
-          <w:b/>
-        </w:rPr>
-        <w:t xml:space="preserve">Solution: </w:t>
-      </w:r>
-      <w:r>
-        <w:rPr>
-          <w:rFonts w:ascii="Calibri" w:hAnsi="Calibri"/>
-        </w:rPr>
-        <w:t>B) False. Consumers read field names, not intentions. Use aliases or dual fields during a migration.</w:t>
-      </w:r>
-    </w:p>
-    <w:p>
-      <w:pPr>
-        <w:pStyle w:val="Heading2"/>
-        <w:rPr>
-          <w:rFonts w:ascii="Calibri" w:hAnsi="Calibri"/>
-        </w:rPr>
-      </w:pPr>
-      <w:r>
-        <w:rPr>
-          <w:rFonts w:ascii="Calibri" w:hAnsi="Calibri"/>
-        </w:rPr>
-        <w:t>Exercise 7 - Create dimensions and facts</w:t>
-      </w:r>
-    </w:p>
-    <w:p>
-      <w:pPr>
-        <w:pStyle w:val="Normal"/>
-        <w:rPr>
-          <w:rFonts w:ascii="Calibri" w:hAnsi="Calibri"/>
-        </w:rPr>
-      </w:pPr>
-      <w:r>
-        <w:rPr>
-          <w:rFonts w:ascii="Calibri" w:hAnsi="Calibri"/>
-          <w:b/>
-        </w:rPr>
-        <w:t xml:space="preserve">Objective: </w:t>
-      </w:r>
-      <w:r>
-        <w:rPr>
-          <w:rFonts w:ascii="Calibri" w:hAnsi="Calibri"/>
-        </w:rPr>
-        <w:t>Build a customer dimension and order fact table from Silver records.</w:t>
-      </w:r>
-    </w:p>
-    <w:p>
-      <w:pPr>
-        <w:pStyle w:val="Normal"/>
-        <w:rPr>
-          <w:rFonts w:ascii="Calibri" w:hAnsi="Calibri"/>
-        </w:rPr>
-      </w:pPr>
-      <w:r>
-        <w:rPr>
-          <w:rFonts w:ascii="Calibri" w:hAnsi="Calibri"/>
-          <w:b/>
-        </w:rPr>
-        <w:t xml:space="preserve">Explanation: </w:t>
-      </w:r>
-      <w:r>
-        <w:rPr>
-          <w:rFonts w:ascii="Calibri" w:hAnsi="Calibri"/>
-        </w:rPr>
-        <w:t>Medallion pipelines often start dimensional modeling in Silver and serve aggregated views in Gold. This keeps BI logic consistent.</w:t>
-      </w:r>
-    </w:p>
-    <w:p>
-      <w:pPr>
-        <w:pStyle w:val="Normal"/>
-        <w:rPr>
-          <w:rFonts w:ascii="Calibri" w:hAnsi="Calibri"/>
-        </w:rPr>
-      </w:pPr>
-      <w:r>
-        <w:rPr>
-          <w:rFonts w:ascii="Calibri" w:hAnsi="Calibri"/>
-        </w:rPr>
-        <w:t>Commands:</w:t>
+        <w:t>python medallion_pipeline.py all</w:t>
       </w:r>
     </w:p>
     <w:p>
@@ -2601,7 +2620,139 @@
           <w:color w:val="263242"/>
           <w:sz w:val="18"/>
         </w:rPr>
-        <w:t>python medallion_pipeline.py all</w:t>
+        <w:t>python -c "import csv; print(list(csv.DictReader(open('outputs/silver/dim_customer.csv')))); print(list(csv.DictReader(open('outputs/silver/fact_orders.csv'))))"</w:t>
+      </w:r>
+    </w:p>
+    <w:p>
+      <w:pPr>
+        <w:pStyle w:val="Normal"/>
+        <w:ind w:start="360"/>
+        <w:rPr>
+          <w:rFonts w:ascii="Calibri" w:hAnsi="Calibri"/>
+        </w:rPr>
+      </w:pPr>
+      <w:r>
+        <w:rPr>
+          <w:rFonts w:ascii="Calibri" w:hAnsi="Calibri"/>
+          <w:b/>
+        </w:rPr>
+        <w:t xml:space="preserve">Expected output: </w:t>
+      </w:r>
+      <w:r>
+        <w:rPr>
+          <w:rFonts w:ascii="Calibri" w:hAnsi="Calibri"/>
+        </w:rPr>
+        <w:t>dim_customer includes customer attributes. fact_orders includes order_id, order_date, customer_key, region, status, and amount.</w:t>
+      </w:r>
+    </w:p>
+    <w:p>
+      <w:pPr>
+        <w:pStyle w:val="Normal"/>
+        <w:rPr>
+          <w:rFonts w:ascii="Calibri" w:hAnsi="Calibri"/>
+        </w:rPr>
+      </w:pPr>
+      <w:r>
+        <w:rPr>
+          <w:rFonts w:ascii="Calibri" w:hAnsi="Calibri"/>
+          <w:b/>
+        </w:rPr>
+        <w:t xml:space="preserve">Mini exercise: </w:t>
+      </w:r>
+      <w:r>
+        <w:rPr>
+          <w:rFonts w:ascii="Calibri" w:hAnsi="Calibri"/>
+        </w:rPr>
+        <w:t>Classify: customer_tier belongs in a dimension or fact?</w:t>
+      </w:r>
+    </w:p>
+    <w:p>
+      <w:pPr>
+        <w:pStyle w:val="Normal"/>
+        <w:rPr>
+          <w:rFonts w:ascii="Calibri" w:hAnsi="Calibri"/>
+        </w:rPr>
+      </w:pPr>
+      <w:r>
+        <w:rPr>
+          <w:rFonts w:ascii="Calibri" w:hAnsi="Calibri"/>
+          <w:b/>
+        </w:rPr>
+        <w:t xml:space="preserve">Solution: </w:t>
+      </w:r>
+      <w:r>
+        <w:rPr>
+          <w:rFonts w:ascii="Calibri" w:hAnsi="Calibri"/>
+        </w:rPr>
+        <w:t>Dimension. It describes the customer entity and can be joined to order facts for analysis.</w:t>
+      </w:r>
+    </w:p>
+    <w:p>
+      <w:pPr>
+        <w:pStyle w:val="Heading2"/>
+        <w:rPr>
+          <w:rFonts w:ascii="Calibri" w:hAnsi="Calibri"/>
+        </w:rPr>
+      </w:pPr>
+      <w:r>
+        <w:rPr/>
+        <w:t>Exercise 8 - Publish Gold KPIs</w:t>
+      </w:r>
+    </w:p>
+    <w:p>
+      <w:pPr>
+        <w:pStyle w:val="Normal"/>
+        <w:rPr>
+          <w:rFonts w:ascii="Calibri" w:hAnsi="Calibri"/>
+        </w:rPr>
+      </w:pPr>
+      <w:r>
+        <w:rPr>
+          <w:rFonts w:ascii="Calibri" w:hAnsi="Calibri"/>
+          <w:b/>
+        </w:rPr>
+        <w:t xml:space="preserve">Objective: </w:t>
+      </w:r>
+      <w:r>
+        <w:rPr>
+          <w:rFonts w:ascii="Calibri" w:hAnsi="Calibri"/>
+        </w:rPr>
+        <w:t>Create business-ready Gold summaries for daily revenue, region orders, and clickstream activity.</w:t>
+      </w:r>
+    </w:p>
+    <w:p>
+      <w:pPr>
+        <w:pStyle w:val="Normal"/>
+        <w:rPr>
+          <w:rFonts w:ascii="Calibri" w:hAnsi="Calibri"/>
+        </w:rPr>
+      </w:pPr>
+      <w:r>
+        <w:rPr>
+          <w:rFonts w:ascii="Calibri" w:hAnsi="Calibri"/>
+          <w:b/>
+        </w:rPr>
+        <w:t xml:space="preserve">Explanation: </w:t>
+      </w:r>
+      <w:r>
+        <w:rPr>
+          <w:rFonts w:ascii="Calibri" w:hAnsi="Calibri"/>
+        </w:rPr>
+        <w:t>Gold tables answer business questions. They should be small, named clearly, and built from validated Silver data.</w:t>
+      </w:r>
+    </w:p>
+    <w:p>
+      <w:pPr>
+        <w:pStyle w:val="Normal"/>
+        <w:rPr>
+          <w:rFonts w:ascii="Calibri" w:hAnsi="Calibri"/>
+        </w:rPr>
+      </w:pPr>
+      <w:r>
+        <w:rPr>
+          <w:rFonts w:ascii="Calibri" w:hAnsi="Calibri"/>
+        </w:rPr>
+        <w:t>Commands:</w:t>
       </w:r>
     </w:p>
     <w:p>
@@ -2619,141 +2770,7 @@
           <w:color w:val="263242"/>
           <w:sz w:val="18"/>
         </w:rPr>
-        <w:t>python -c "import csv; print(list(csv.DictReader(open('outputs/silver/dim_customer.csv')))); print(list(csv.DictReader(open('outputs/silver/fact_orders.csv'))))"</w:t>
-      </w:r>
-    </w:p>
-    <w:p>
-      <w:pPr>
-        <w:pStyle w:val="Normal"/>
-        <w:ind w:start="360"/>
-        <w:rPr>
-          <w:rFonts w:ascii="Calibri" w:hAnsi="Calibri"/>
-        </w:rPr>
-      </w:pPr>
-      <w:r>
-        <w:rPr>
-          <w:rFonts w:ascii="Calibri" w:hAnsi="Calibri"/>
-          <w:b/>
-        </w:rPr>
-        <w:t xml:space="preserve">Expected output: </w:t>
-      </w:r>
-      <w:r>
-        <w:rPr>
-          <w:rFonts w:ascii="Calibri" w:hAnsi="Calibri"/>
-        </w:rPr>
-        <w:t>dim_customer includes customer attributes. fact_orders includes order_id, order_date, customer_key, region, status, and amount.</w:t>
-      </w:r>
-    </w:p>
-    <w:p>
-      <w:pPr>
-        <w:pStyle w:val="Normal"/>
-        <w:rPr>
-          <w:rFonts w:ascii="Calibri" w:hAnsi="Calibri"/>
-        </w:rPr>
-      </w:pPr>
-      <w:r>
-        <w:rPr>
-          <w:rFonts w:ascii="Calibri" w:hAnsi="Calibri"/>
-          <w:b/>
-        </w:rPr>
-        <w:t xml:space="preserve">Mini exercise: </w:t>
-      </w:r>
-      <w:r>
-        <w:rPr>
-          <w:rFonts w:ascii="Calibri" w:hAnsi="Calibri"/>
-        </w:rPr>
-        <w:t>Classify: customer_tier belongs in a dimension or fact?</w:t>
-      </w:r>
-    </w:p>
-    <w:p>
-      <w:pPr>
-        <w:pStyle w:val="Normal"/>
-        <w:rPr>
-          <w:rFonts w:ascii="Calibri" w:hAnsi="Calibri"/>
-        </w:rPr>
-      </w:pPr>
-      <w:r>
-        <w:rPr>
-          <w:rFonts w:ascii="Calibri" w:hAnsi="Calibri"/>
-          <w:b/>
-        </w:rPr>
-        <w:t xml:space="preserve">Solution: </w:t>
-      </w:r>
-      <w:r>
-        <w:rPr>
-          <w:rFonts w:ascii="Calibri" w:hAnsi="Calibri"/>
-        </w:rPr>
-        <w:t>Dimension. It describes the customer entity and can be joined to order facts for analysis.</w:t>
-      </w:r>
-    </w:p>
-    <w:p>
-      <w:pPr>
-        <w:pStyle w:val="Heading2"/>
-        <w:rPr>
-          <w:rFonts w:ascii="Calibri" w:hAnsi="Calibri"/>
-        </w:rPr>
-      </w:pPr>
-      <w:r>
-        <w:rPr>
-          <w:rFonts w:ascii="Calibri" w:hAnsi="Calibri"/>
-        </w:rPr>
-        <w:t>Exercise 8 - Publish Gold KPIs</w:t>
-      </w:r>
-    </w:p>
-    <w:p>
-      <w:pPr>
-        <w:pStyle w:val="Normal"/>
-        <w:rPr>
-          <w:rFonts w:ascii="Calibri" w:hAnsi="Calibri"/>
-        </w:rPr>
-      </w:pPr>
-      <w:r>
-        <w:rPr>
-          <w:rFonts w:ascii="Calibri" w:hAnsi="Calibri"/>
-          <w:b/>
-        </w:rPr>
-        <w:t xml:space="preserve">Objective: </w:t>
-      </w:r>
-      <w:r>
-        <w:rPr>
-          <w:rFonts w:ascii="Calibri" w:hAnsi="Calibri"/>
-        </w:rPr>
-        <w:t>Create business-ready Gold summaries for daily revenue, region orders, and clickstream activity.</w:t>
-      </w:r>
-    </w:p>
-    <w:p>
-      <w:pPr>
-        <w:pStyle w:val="Normal"/>
-        <w:rPr>
-          <w:rFonts w:ascii="Calibri" w:hAnsi="Calibri"/>
-        </w:rPr>
-      </w:pPr>
-      <w:r>
-        <w:rPr>
-          <w:rFonts w:ascii="Calibri" w:hAnsi="Calibri"/>
-          <w:b/>
-        </w:rPr>
-        <w:t xml:space="preserve">Explanation: </w:t>
-      </w:r>
-      <w:r>
-        <w:rPr>
-          <w:rFonts w:ascii="Calibri" w:hAnsi="Calibri"/>
-        </w:rPr>
-        <w:t>Gold tables answer business questions. They should be small, named clearly, and built from validated Silver data.</w:t>
-      </w:r>
-    </w:p>
-    <w:p>
-      <w:pPr>
-        <w:pStyle w:val="Normal"/>
-        <w:rPr>
-          <w:rFonts w:ascii="Calibri" w:hAnsi="Calibri"/>
-        </w:rPr>
-      </w:pPr>
-      <w:r>
-        <w:rPr>
-          <w:rFonts w:ascii="Calibri" w:hAnsi="Calibri"/>
-        </w:rPr>
-        <w:t>Commands:</w:t>
+        <w:t>python medallion_pipeline.py all</w:t>
       </w:r>
     </w:p>
     <w:p>
@@ -2771,7 +2788,139 @@
           <w:color w:val="263242"/>
           <w:sz w:val="18"/>
         </w:rPr>
-        <w:t>python medallion_pipeline.py all</w:t>
+        <w:t>python -c "import csv; print(list(csv.DictReader(open('outputs/gold/daily_order_kpis.csv'))))"</w:t>
+      </w:r>
+    </w:p>
+    <w:p>
+      <w:pPr>
+        <w:pStyle w:val="Normal"/>
+        <w:ind w:start="360"/>
+        <w:rPr>
+          <w:rFonts w:ascii="Calibri" w:hAnsi="Calibri"/>
+        </w:rPr>
+      </w:pPr>
+      <w:r>
+        <w:rPr>
+          <w:rFonts w:ascii="Calibri" w:hAnsi="Calibri"/>
+          <w:b/>
+        </w:rPr>
+        <w:t xml:space="preserve">Expected output: </w:t>
+      </w:r>
+      <w:r>
+        <w:rPr>
+          <w:rFonts w:ascii="Calibri" w:hAnsi="Calibri"/>
+        </w:rPr>
+        <w:t>The daily KPI has 2 paid/shipped orders and recognized_revenue of 195.50.</w:t>
+      </w:r>
+    </w:p>
+    <w:p>
+      <w:pPr>
+        <w:pStyle w:val="Normal"/>
+        <w:rPr>
+          <w:rFonts w:ascii="Calibri" w:hAnsi="Calibri"/>
+        </w:rPr>
+      </w:pPr>
+      <w:r>
+        <w:rPr>
+          <w:rFonts w:ascii="Calibri" w:hAnsi="Calibri"/>
+          <w:b/>
+        </w:rPr>
+        <w:t xml:space="preserve">Mini exercise: </w:t>
+      </w:r>
+      <w:r>
+        <w:rPr>
+          <w:rFonts w:ascii="Calibri" w:hAnsi="Calibri"/>
+        </w:rPr>
+        <w:t>Fill in the blank: Gold should be optimized for ____ users and dashboards.</w:t>
+      </w:r>
+    </w:p>
+    <w:p>
+      <w:pPr>
+        <w:pStyle w:val="Normal"/>
+        <w:rPr>
+          <w:rFonts w:ascii="Calibri" w:hAnsi="Calibri"/>
+        </w:rPr>
+      </w:pPr>
+      <w:r>
+        <w:rPr>
+          <w:rFonts w:ascii="Calibri" w:hAnsi="Calibri"/>
+          <w:b/>
+        </w:rPr>
+        <w:t xml:space="preserve">Solution: </w:t>
+      </w:r>
+      <w:r>
+        <w:rPr>
+          <w:rFonts w:ascii="Calibri" w:hAnsi="Calibri"/>
+        </w:rPr>
+        <w:t>business. Gold aligns measures, grain, and labels with reporting needs.</w:t>
+      </w:r>
+    </w:p>
+    <w:p>
+      <w:pPr>
+        <w:pStyle w:val="Heading2"/>
+        <w:rPr>
+          <w:rFonts w:ascii="Calibri" w:hAnsi="Calibri"/>
+        </w:rPr>
+      </w:pPr>
+      <w:r>
+        <w:rPr/>
+        <w:t>Exercise 9 - Replay after fixing a bad record</w:t>
+      </w:r>
+    </w:p>
+    <w:p>
+      <w:pPr>
+        <w:pStyle w:val="Normal"/>
+        <w:rPr>
+          <w:rFonts w:ascii="Calibri" w:hAnsi="Calibri"/>
+        </w:rPr>
+      </w:pPr>
+      <w:r>
+        <w:rPr>
+          <w:rFonts w:ascii="Calibri" w:hAnsi="Calibri"/>
+          <w:b/>
+        </w:rPr>
+        <w:t xml:space="preserve">Objective: </w:t>
+      </w:r>
+      <w:r>
+        <w:rPr>
+          <w:rFonts w:ascii="Calibri" w:hAnsi="Calibri"/>
+        </w:rPr>
+        <w:t>Practice replayability by correcting a logistics row and rerunning the pipeline.</w:t>
+      </w:r>
+    </w:p>
+    <w:p>
+      <w:pPr>
+        <w:pStyle w:val="Normal"/>
+        <w:rPr>
+          <w:rFonts w:ascii="Calibri" w:hAnsi="Calibri"/>
+        </w:rPr>
+      </w:pPr>
+      <w:r>
+        <w:rPr>
+          <w:rFonts w:ascii="Calibri" w:hAnsi="Calibri"/>
+          <w:b/>
+        </w:rPr>
+        <w:t xml:space="preserve">Explanation: </w:t>
+      </w:r>
+      <w:r>
+        <w:rPr>
+          <w:rFonts w:ascii="Calibri" w:hAnsi="Calibri"/>
+        </w:rPr>
+        <w:t>In production, DLQ replay should be deliberate. Fix the source record, rerun, and compare quality counts so the team can prove the defect is closed.</w:t>
+      </w:r>
+    </w:p>
+    <w:p>
+      <w:pPr>
+        <w:pStyle w:val="Normal"/>
+        <w:rPr>
+          <w:rFonts w:ascii="Calibri" w:hAnsi="Calibri"/>
+        </w:rPr>
+      </w:pPr>
+      <w:r>
+        <w:rPr>
+          <w:rFonts w:ascii="Calibri" w:hAnsi="Calibri"/>
+        </w:rPr>
+        <w:t>Commands:</w:t>
       </w:r>
     </w:p>
     <w:p>
@@ -2789,141 +2938,7 @@
           <w:color w:val="263242"/>
           <w:sz w:val="18"/>
         </w:rPr>
-        <w:t>python -c "import csv; print(list(csv.DictReader(open('outputs/gold/daily_order_kpis.csv'))))"</w:t>
-      </w:r>
-    </w:p>
-    <w:p>
-      <w:pPr>
-        <w:pStyle w:val="Normal"/>
-        <w:ind w:start="360"/>
-        <w:rPr>
-          <w:rFonts w:ascii="Calibri" w:hAnsi="Calibri"/>
-        </w:rPr>
-      </w:pPr>
-      <w:r>
-        <w:rPr>
-          <w:rFonts w:ascii="Calibri" w:hAnsi="Calibri"/>
-          <w:b/>
-        </w:rPr>
-        <w:t xml:space="preserve">Expected output: </w:t>
-      </w:r>
-      <w:r>
-        <w:rPr>
-          <w:rFonts w:ascii="Calibri" w:hAnsi="Calibri"/>
-        </w:rPr>
-        <w:t>The daily KPI has 2 paid/shipped orders and recognized_revenue of 195.50.</w:t>
-      </w:r>
-    </w:p>
-    <w:p>
-      <w:pPr>
-        <w:pStyle w:val="Normal"/>
-        <w:rPr>
-          <w:rFonts w:ascii="Calibri" w:hAnsi="Calibri"/>
-        </w:rPr>
-      </w:pPr>
-      <w:r>
-        <w:rPr>
-          <w:rFonts w:ascii="Calibri" w:hAnsi="Calibri"/>
-          <w:b/>
-        </w:rPr>
-        <w:t xml:space="preserve">Mini exercise: </w:t>
-      </w:r>
-      <w:r>
-        <w:rPr>
-          <w:rFonts w:ascii="Calibri" w:hAnsi="Calibri"/>
-        </w:rPr>
-        <w:t>Fill in the blank: Gold should be optimized for ____ users and dashboards.</w:t>
-      </w:r>
-    </w:p>
-    <w:p>
-      <w:pPr>
-        <w:pStyle w:val="Normal"/>
-        <w:rPr>
-          <w:rFonts w:ascii="Calibri" w:hAnsi="Calibri"/>
-        </w:rPr>
-      </w:pPr>
-      <w:r>
-        <w:rPr>
-          <w:rFonts w:ascii="Calibri" w:hAnsi="Calibri"/>
-          <w:b/>
-        </w:rPr>
-        <w:t xml:space="preserve">Solution: </w:t>
-      </w:r>
-      <w:r>
-        <w:rPr>
-          <w:rFonts w:ascii="Calibri" w:hAnsi="Calibri"/>
-        </w:rPr>
-        <w:t>business. Gold aligns measures, grain, and labels with reporting needs.</w:t>
-      </w:r>
-    </w:p>
-    <w:p>
-      <w:pPr>
-        <w:pStyle w:val="Heading2"/>
-        <w:rPr>
-          <w:rFonts w:ascii="Calibri" w:hAnsi="Calibri"/>
-        </w:rPr>
-      </w:pPr>
-      <w:r>
-        <w:rPr>
-          <w:rFonts w:ascii="Calibri" w:hAnsi="Calibri"/>
-        </w:rPr>
-        <w:t>Exercise 9 - Replay after fixing a bad record</w:t>
-      </w:r>
-    </w:p>
-    <w:p>
-      <w:pPr>
-        <w:pStyle w:val="Normal"/>
-        <w:rPr>
-          <w:rFonts w:ascii="Calibri" w:hAnsi="Calibri"/>
-        </w:rPr>
-      </w:pPr>
-      <w:r>
-        <w:rPr>
-          <w:rFonts w:ascii="Calibri" w:hAnsi="Calibri"/>
-          <w:b/>
-        </w:rPr>
-        <w:t xml:space="preserve">Objective: </w:t>
-      </w:r>
-      <w:r>
-        <w:rPr>
-          <w:rFonts w:ascii="Calibri" w:hAnsi="Calibri"/>
-        </w:rPr>
-        <w:t>Practice replayability by correcting a logistics row and rerunning the pipeline.</w:t>
-      </w:r>
-    </w:p>
-    <w:p>
-      <w:pPr>
-        <w:pStyle w:val="Normal"/>
-        <w:rPr>
-          <w:rFonts w:ascii="Calibri" w:hAnsi="Calibri"/>
-        </w:rPr>
-      </w:pPr>
-      <w:r>
-        <w:rPr>
-          <w:rFonts w:ascii="Calibri" w:hAnsi="Calibri"/>
-          <w:b/>
-        </w:rPr>
-        <w:t xml:space="preserve">Explanation: </w:t>
-      </w:r>
-      <w:r>
-        <w:rPr>
-          <w:rFonts w:ascii="Calibri" w:hAnsi="Calibri"/>
-        </w:rPr>
-        <w:t>In production, DLQ replay should be deliberate. Fix the source record, rerun, and compare quality counts so the team can prove the defect is closed.</w:t>
-      </w:r>
-    </w:p>
-    <w:p>
-      <w:pPr>
-        <w:pStyle w:val="Normal"/>
-        <w:rPr>
-          <w:rFonts w:ascii="Calibri" w:hAnsi="Calibri"/>
-        </w:rPr>
-      </w:pPr>
-      <w:r>
-        <w:rPr>
-          <w:rFonts w:ascii="Calibri" w:hAnsi="Calibri"/>
-        </w:rPr>
-        <w:t>Commands:</w:t>
+        <w:t>python -c "from pathlib import Path; p=Path('input/logistics_batch.csv'); s=p.read_text(); p.write_text(s.replace(',1003,BlueDart,CREATED','SHP-9003,1001,BlueDart,CREATED'))"</w:t>
       </w:r>
     </w:p>
     <w:p>
@@ -2941,7 +2956,7 @@
           <w:color w:val="263242"/>
           <w:sz w:val="18"/>
         </w:rPr>
-        <w:t>python -c "from pathlib import Path; p=Path('input/logistics_batch.csv'); s=p.read_text(); p.write_text(s.replace(',1003,BlueDart,CREATED','SHP-9003,1001,BlueDart,CREATED'))"</w:t>
+        <w:t>python medallion_pipeline.py all</w:t>
       </w:r>
     </w:p>
     <w:p>
@@ -2959,7 +2974,7 @@
           <w:color w:val="263242"/>
           <w:sz w:val="18"/>
         </w:rPr>
-        <w:t>python medallion_pipeline.py all</w:t>
+        <w:t>python -m json.tool outputs/silver/data_quality_report.json</w:t>
       </w:r>
     </w:p>
     <w:p>
@@ -2977,7 +2992,7 @@
           <w:color w:val="263242"/>
           <w:sz w:val="18"/>
         </w:rPr>
-        <w:t>python -m json.tool outputs/silver/data_quality_report.json</w:t>
+        <w:t># Restore the original lab data and rerun the proof baseline:</w:t>
       </w:r>
     </w:p>
     <w:p>
@@ -2995,7 +3010,7 @@
           <w:color w:val="263242"/>
           <w:sz w:val="18"/>
         </w:rPr>
-        <w:t># Restore the original lab data and rerun the proof baseline:</w:t>
+        <w:t>python -c "from pathlib import Path; p=Path('input/logistics_batch.csv'); s=p.read_text(); p.write_text(s.replace('SHP-9003,1001,BlueDart,CREATED',',1003,BlueDart,CREATED'))"</w:t>
       </w:r>
     </w:p>
     <w:p>
@@ -3013,7 +3028,97 @@
           <w:color w:val="263242"/>
           <w:sz w:val="18"/>
         </w:rPr>
-        <w:t>python -c "from pathlib import Path; p=Path('input/logistics_batch.csv'); s=p.read_text(); p.write_text(s.replace('SHP-9003,1001,BlueDart,CREATED',',1003,BlueDart,CREATED'))"</w:t>
+        <w:t>python run_day5_lab_tests.py</w:t>
+      </w:r>
+    </w:p>
+    <w:p>
+      <w:pPr>
+        <w:pStyle w:val="Normal"/>
+        <w:ind w:start="360"/>
+        <w:rPr>
+          <w:rFonts w:ascii="Calibri" w:hAnsi="Calibri"/>
+        </w:rPr>
+      </w:pPr>
+      <w:r>
+        <w:rPr>
+          <w:rFonts w:ascii="Calibri" w:hAnsi="Calibri"/>
+          <w:b/>
+        </w:rPr>
+        <w:t xml:space="preserve">Expected output: </w:t>
+      </w:r>
+      <w:r>
+        <w:rPr>
+          <w:rFonts w:ascii="Calibri" w:hAnsi="Calibri"/>
+        </w:rPr>
+        <w:t>While the corrected row is active, dlq_records drops from 2 to 1 and valid_shipments rises from 2 to 3. After restoring the file, the proof runner returns to the validated baseline.</w:t>
+      </w:r>
+    </w:p>
+    <w:p>
+      <w:pPr>
+        <w:pStyle w:val="Normal"/>
+        <w:rPr>
+          <w:rFonts w:ascii="Calibri" w:hAnsi="Calibri"/>
+        </w:rPr>
+      </w:pPr>
+      <w:r>
+        <w:rPr>
+          <w:rFonts w:ascii="Calibri" w:hAnsi="Calibri"/>
+          <w:b/>
+        </w:rPr>
+        <w:t xml:space="preserve">Mini exercise: </w:t>
+      </w:r>
+      <w:r>
+        <w:rPr>
+          <w:rFonts w:ascii="Calibri" w:hAnsi="Calibri"/>
+        </w:rPr>
+        <w:t>Why compare quality counts before and after replay?</w:t>
+      </w:r>
+    </w:p>
+    <w:p>
+      <w:pPr>
+        <w:pStyle w:val="Normal"/>
+        <w:rPr>
+          <w:rFonts w:ascii="Calibri" w:hAnsi="Calibri"/>
+        </w:rPr>
+      </w:pPr>
+      <w:r>
+        <w:rPr>
+          <w:rFonts w:ascii="Calibri" w:hAnsi="Calibri"/>
+          <w:b/>
+        </w:rPr>
+        <w:t xml:space="preserve">Solution: </w:t>
+      </w:r>
+      <w:r>
+        <w:rPr>
+          <w:rFonts w:ascii="Calibri" w:hAnsi="Calibri"/>
+        </w:rPr>
+        <w:t>It proves the correction changed the pipeline outcome. In a real team, update expected counts only after approving the replay result.</w:t>
+      </w:r>
+    </w:p>
+    <w:p>
+      <w:pPr>
+        <w:pStyle w:val="Heading2"/>
+        <w:rPr>
+          <w:rFonts w:ascii="Calibri" w:hAnsi="Calibri"/>
+        </w:rPr>
+      </w:pPr>
+      <w:r>
+        <w:rPr/>
+        <w:t xml:space="preserve">Exercise 10 - Clean up </w:t>
+      </w:r>
+    </w:p>
+    <w:p>
+      <w:pPr>
+        <w:pStyle w:val="Normal"/>
+        <w:rPr>
+          <w:rFonts w:ascii="Calibri" w:hAnsi="Calibri"/>
+        </w:rPr>
+      </w:pPr>
+      <w:r>
+        <w:rPr>
+          <w:rFonts w:ascii="Calibri" w:hAnsi="Calibri"/>
+        </w:rPr>
+        <w:t>Commands:</w:t>
       </w:r>
     </w:p>
     <w:p>
@@ -3031,99 +3136,7 @@
           <w:color w:val="263242"/>
           <w:sz w:val="18"/>
         </w:rPr>
-        <w:t>python run_day5_lab_tests.py</w:t>
-      </w:r>
-    </w:p>
-    <w:p>
-      <w:pPr>
-        <w:pStyle w:val="Normal"/>
-        <w:ind w:start="360"/>
-        <w:rPr>
-          <w:rFonts w:ascii="Calibri" w:hAnsi="Calibri"/>
-        </w:rPr>
-      </w:pPr>
-      <w:r>
-        <w:rPr>
-          <w:rFonts w:ascii="Calibri" w:hAnsi="Calibri"/>
-          <w:b/>
-        </w:rPr>
-        <w:t xml:space="preserve">Expected output: </w:t>
-      </w:r>
-      <w:r>
-        <w:rPr>
-          <w:rFonts w:ascii="Calibri" w:hAnsi="Calibri"/>
-        </w:rPr>
-        <w:t>While the corrected row is active, dlq_records drops from 2 to 1 and valid_shipments rises from 2 to 3. After restoring the file, the proof runner returns to the validated baseline.</w:t>
-      </w:r>
-    </w:p>
-    <w:p>
-      <w:pPr>
-        <w:pStyle w:val="Normal"/>
-        <w:rPr>
-          <w:rFonts w:ascii="Calibri" w:hAnsi="Calibri"/>
-        </w:rPr>
-      </w:pPr>
-      <w:r>
-        <w:rPr>
-          <w:rFonts w:ascii="Calibri" w:hAnsi="Calibri"/>
-          <w:b/>
-        </w:rPr>
-        <w:t xml:space="preserve">Mini exercise: </w:t>
-      </w:r>
-      <w:r>
-        <w:rPr>
-          <w:rFonts w:ascii="Calibri" w:hAnsi="Calibri"/>
-        </w:rPr>
-        <w:t>Why compare quality counts before and after replay?</w:t>
-      </w:r>
-    </w:p>
-    <w:p>
-      <w:pPr>
-        <w:pStyle w:val="Normal"/>
-        <w:rPr>
-          <w:rFonts w:ascii="Calibri" w:hAnsi="Calibri"/>
-        </w:rPr>
-      </w:pPr>
-      <w:r>
-        <w:rPr>
-          <w:rFonts w:ascii="Calibri" w:hAnsi="Calibri"/>
-          <w:b/>
-        </w:rPr>
-        <w:t xml:space="preserve">Solution: </w:t>
-      </w:r>
-      <w:r>
-        <w:rPr>
-          <w:rFonts w:ascii="Calibri" w:hAnsi="Calibri"/>
-        </w:rPr>
-        <w:t>It proves the correction changed the pipeline outcome. In a real team, update expected counts only after approving the replay result.</w:t>
-      </w:r>
-    </w:p>
-    <w:p>
-      <w:pPr>
-        <w:pStyle w:val="Heading2"/>
-        <w:rPr>
-          <w:rFonts w:ascii="Calibri" w:hAnsi="Calibri"/>
-        </w:rPr>
-      </w:pPr>
-      <w:r>
-        <w:rPr>
-          <w:rFonts w:ascii="Calibri" w:hAnsi="Calibri"/>
-        </w:rPr>
-        <w:t xml:space="preserve">Exercise 10 - Clean up </w:t>
-      </w:r>
-    </w:p>
-    <w:p>
-      <w:pPr>
-        <w:pStyle w:val="Normal"/>
-        <w:rPr>
-          <w:rFonts w:ascii="Calibri" w:hAnsi="Calibri"/>
-        </w:rPr>
-      </w:pPr>
-      <w:r>
-        <w:rPr>
-          <w:rFonts w:ascii="Calibri" w:hAnsi="Calibri"/>
-        </w:rPr>
-        <w:t>Commands:</w:t>
+        <w:t>python run_day5_lab_tests.py --qa-dir ../../outputs/day5_client_ready_qa</w:t>
       </w:r>
     </w:p>
     <w:p>
@@ -3141,7 +3154,7 @@
           <w:color w:val="263242"/>
           <w:sz w:val="18"/>
         </w:rPr>
-        <w:t>python run_day5_lab_tests.py --qa-dir ../../outputs/day5_client_ready_qa</w:t>
+        <w:t># If you started Kafka/Debezium during the optional integration path:</w:t>
       </w:r>
     </w:p>
     <w:p>
@@ -3159,7 +3172,97 @@
           <w:color w:val="263242"/>
           <w:sz w:val="18"/>
         </w:rPr>
-        <w:t># If you started Kafka/Debezium during the optional integration path:</w:t>
+        <w:t>docker compose down -v</w:t>
+      </w:r>
+    </w:p>
+    <w:p>
+      <w:pPr>
+        <w:pStyle w:val="Normal"/>
+        <w:ind w:start="360"/>
+        <w:rPr>
+          <w:rFonts w:ascii="Calibri" w:hAnsi="Calibri"/>
+        </w:rPr>
+      </w:pPr>
+      <w:r>
+        <w:rPr>
+          <w:rFonts w:ascii="Calibri" w:hAnsi="Calibri"/>
+          <w:b/>
+        </w:rPr>
+        <w:t xml:space="preserve">Expected output: </w:t>
+      </w:r>
+      <w:r>
+        <w:rPr>
+          <w:rFonts w:ascii="Calibri" w:hAnsi="Calibri"/>
+        </w:rPr>
+        <w:t>outputs/day5_client_ready_qa/day5_lab_test_run.log contains PASS lines. docker compose down -v removes the optional lab containers and volumes.</w:t>
+      </w:r>
+    </w:p>
+    <w:p>
+      <w:pPr>
+        <w:pStyle w:val="Normal"/>
+        <w:rPr>
+          <w:rFonts w:ascii="Calibri" w:hAnsi="Calibri"/>
+        </w:rPr>
+      </w:pPr>
+      <w:r>
+        <w:rPr>
+          <w:rFonts w:ascii="Calibri" w:hAnsi="Calibri"/>
+          <w:b/>
+        </w:rPr>
+        <w:t xml:space="preserve">Mini exercise: </w:t>
+      </w:r>
+      <w:r>
+        <w:rPr>
+          <w:rFonts w:ascii="Calibri" w:hAnsi="Calibri"/>
+        </w:rPr>
+        <w:t>Which file proves the one-command lab validation was run?</w:t>
+      </w:r>
+    </w:p>
+    <w:p>
+      <w:pPr>
+        <w:pStyle w:val="Normal"/>
+        <w:rPr>
+          <w:rFonts w:ascii="Calibri" w:hAnsi="Calibri"/>
+        </w:rPr>
+      </w:pPr>
+      <w:r>
+        <w:rPr>
+          <w:rFonts w:ascii="Calibri" w:hAnsi="Calibri"/>
+          <w:b/>
+        </w:rPr>
+        <w:t xml:space="preserve">Solution: </w:t>
+      </w:r>
+      <w:r>
+        <w:rPr>
+          <w:rFonts w:ascii="Calibri" w:hAnsi="Calibri"/>
+        </w:rPr>
+        <w:t>outputs/day5_client_ready_qa/day5_lab_test_run.log.</w:t>
+      </w:r>
+    </w:p>
+    <w:p>
+      <w:pPr>
+        <w:pStyle w:val="Heading1"/>
+        <w:rPr>
+          <w:rFonts w:ascii="Calibri" w:hAnsi="Calibri"/>
+        </w:rPr>
+      </w:pPr>
+      <w:r>
+        <w:rPr/>
+        <w:t>Optional Kafka/Debezium Integration Path</w:t>
+      </w:r>
+    </w:p>
+    <w:p>
+      <w:pPr>
+        <w:pStyle w:val="Normal"/>
+        <w:rPr>
+          <w:rFonts w:ascii="Calibri" w:hAnsi="Calibri"/>
+        </w:rPr>
+      </w:pPr>
+      <w:r>
+        <w:rPr>
+          <w:rFonts w:ascii="Calibri" w:hAnsi="Calibri"/>
+        </w:rPr>
+        <w:t>Use this path when class time and machine resources allow the full streaming stack. The core medallion proof above is intentionally lightweight so the day can still be validated quickly.</w:t>
       </w:r>
     </w:p>
     <w:p>
@@ -3177,99 +3280,7 @@
           <w:color w:val="263242"/>
           <w:sz w:val="18"/>
         </w:rPr>
-        <w:t>docker compose down -v</w:t>
-      </w:r>
-    </w:p>
-    <w:p>
-      <w:pPr>
-        <w:pStyle w:val="Normal"/>
-        <w:ind w:start="360"/>
-        <w:rPr>
-          <w:rFonts w:ascii="Calibri" w:hAnsi="Calibri"/>
-        </w:rPr>
-      </w:pPr>
-      <w:r>
-        <w:rPr>
-          <w:rFonts w:ascii="Calibri" w:hAnsi="Calibri"/>
-          <w:b/>
-        </w:rPr>
-        <w:t xml:space="preserve">Expected output: </w:t>
-      </w:r>
-      <w:r>
-        <w:rPr>
-          <w:rFonts w:ascii="Calibri" w:hAnsi="Calibri"/>
-        </w:rPr>
-        <w:t>outputs/day5_client_ready_qa/day5_lab_test_run.log contains PASS lines. docker compose down -v removes the optional lab containers and volumes.</w:t>
-      </w:r>
-    </w:p>
-    <w:p>
-      <w:pPr>
-        <w:pStyle w:val="Normal"/>
-        <w:rPr>
-          <w:rFonts w:ascii="Calibri" w:hAnsi="Calibri"/>
-        </w:rPr>
-      </w:pPr>
-      <w:r>
-        <w:rPr>
-          <w:rFonts w:ascii="Calibri" w:hAnsi="Calibri"/>
-          <w:b/>
-        </w:rPr>
-        <w:t xml:space="preserve">Mini exercise: </w:t>
-      </w:r>
-      <w:r>
-        <w:rPr>
-          <w:rFonts w:ascii="Calibri" w:hAnsi="Calibri"/>
-        </w:rPr>
-        <w:t>Which file proves the one-command lab validation was run?</w:t>
-      </w:r>
-    </w:p>
-    <w:p>
-      <w:pPr>
-        <w:pStyle w:val="Normal"/>
-        <w:rPr>
-          <w:rFonts w:ascii="Calibri" w:hAnsi="Calibri"/>
-        </w:rPr>
-      </w:pPr>
-      <w:r>
-        <w:rPr>
-          <w:rFonts w:ascii="Calibri" w:hAnsi="Calibri"/>
-          <w:b/>
-        </w:rPr>
-        <w:t xml:space="preserve">Solution: </w:t>
-      </w:r>
-      <w:r>
-        <w:rPr>
-          <w:rFonts w:ascii="Calibri" w:hAnsi="Calibri"/>
-        </w:rPr>
-        <w:t>outputs/day5_client_ready_qa/day5_lab_test_run.log.</w:t>
-      </w:r>
-    </w:p>
-    <w:p>
-      <w:pPr>
-        <w:pStyle w:val="Heading1"/>
-        <w:rPr>
-          <w:rFonts w:ascii="Calibri" w:hAnsi="Calibri"/>
-        </w:rPr>
-      </w:pPr>
-      <w:r>
-        <w:rPr>
-          <w:rFonts w:ascii="Calibri" w:hAnsi="Calibri"/>
-        </w:rPr>
-        <w:t>Optional Kafka/Debezium Integration Path</w:t>
-      </w:r>
-    </w:p>
-    <w:p>
-      <w:pPr>
-        <w:pStyle w:val="Normal"/>
-        <w:rPr>
-          <w:rFonts w:ascii="Calibri" w:hAnsi="Calibri"/>
-        </w:rPr>
-      </w:pPr>
-      <w:r>
-        <w:rPr>
-          <w:rFonts w:ascii="Calibri" w:hAnsi="Calibri"/>
-        </w:rPr>
-        <w:t>Use this path when class time and machine resources allow the full streaming stack. The core medallion proof above is intentionally lightweight so the day can still be validated quickly.</w:t>
+        <w:t>cd Week_01/Day_05/Lab_Files</w:t>
       </w:r>
     </w:p>
     <w:p>
@@ -3287,7 +3298,35 @@
           <w:color w:val="263242"/>
           <w:sz w:val="18"/>
         </w:rPr>
-        <w:t>cd Week_01/Day_05/Lab_Files</w:t>
+        <w:t>docker compose up -d</w:t>
+      </w:r>
+    </w:p>
+    <w:p>
+      <w:pPr>
+        <w:pStyle w:val="Normal"/>
+        <w:rPr>
+          <w:rFonts w:ascii="Calibri" w:hAnsi="Calibri"/>
+        </w:rPr>
+      </w:pPr>
+      <w:r>
+        <w:rPr>
+          <w:rFonts w:ascii="Calibri" w:hAnsi="Calibri"/>
+        </w:rPr>
+        <w:t>Create Kafka topics from kafka_topic_manifest.json before registering connectors.</w:t>
+      </w:r>
+    </w:p>
+    <w:p>
+      <w:pPr>
+        <w:pStyle w:val="Normal"/>
+        <w:rPr>
+          <w:rFonts w:ascii="Calibri" w:hAnsi="Calibri"/>
+        </w:rPr>
+      </w:pPr>
+      <w:r>
+        <w:rPr>
+          <w:rFonts w:ascii="Calibri" w:hAnsi="Calibri"/>
+        </w:rPr>
+        <w:t>Use the topic creation loop in README.md, or create the topics listed in kafka_topic_manifest.json with docker compose exec kafka kafka-topics.</w:t>
       </w:r>
     </w:p>
     <w:p>
@@ -3305,35 +3344,7 @@
           <w:color w:val="263242"/>
           <w:sz w:val="18"/>
         </w:rPr>
-        <w:t>docker compose up -d</w:t>
-      </w:r>
-    </w:p>
-    <w:p>
-      <w:pPr>
-        <w:pStyle w:val="Normal"/>
-        <w:rPr>
-          <w:rFonts w:ascii="Calibri" w:hAnsi="Calibri"/>
-        </w:rPr>
-      </w:pPr>
-      <w:r>
-        <w:rPr>
-          <w:rFonts w:ascii="Calibri" w:hAnsi="Calibri"/>
-        </w:rPr>
-        <w:t>Create Kafka topics from kafka_topic_manifest.json before registering connectors.</w:t>
-      </w:r>
-    </w:p>
-    <w:p>
-      <w:pPr>
-        <w:pStyle w:val="Normal"/>
-        <w:rPr>
-          <w:rFonts w:ascii="Calibri" w:hAnsi="Calibri"/>
-        </w:rPr>
-      </w:pPr>
-      <w:r>
-        <w:rPr>
-          <w:rFonts w:ascii="Calibri" w:hAnsi="Calibri"/>
-        </w:rPr>
-        <w:t>Use the topic creation loop in README.md, or create the topics listed in kafka_topic_manifest.json with docker compose exec kafka kafka-topics.</w:t>
+        <w:t>curl -s http://localhost:8083/connectors</w:t>
       </w:r>
     </w:p>
     <w:p>
@@ -3351,7 +3362,7 @@
           <w:color w:val="263242"/>
           <w:sz w:val="18"/>
         </w:rPr>
-        <w:t>curl -s http://localhost:8083/connectors</w:t>
+        <w:t>curl -X POST -H "Content-Type: application/json" --data @orders-connector.json http://localhost:8083/connectors</w:t>
       </w:r>
     </w:p>
     <w:p>
@@ -3369,7 +3380,7 @@
           <w:color w:val="263242"/>
           <w:sz w:val="18"/>
         </w:rPr>
-        <w:t>curl -X POST -H "Content-Type: application/json" --data @orders-connector.json http://localhost:8083/connectors</w:t>
+        <w:t>curl -X POST -H "Content-Type: application/json" --data @inventory-connector.json http://localhost:8083/connectors</w:t>
       </w:r>
     </w:p>
     <w:p>
@@ -3387,7 +3398,7 @@
           <w:color w:val="263242"/>
           <w:sz w:val="18"/>
         </w:rPr>
-        <w:t>curl -X POST -H "Content-Type: application/json" --data @inventory-connector.json http://localhost:8083/connectors</w:t>
+        <w:t>python clickstream_producer.py</w:t>
       </w:r>
     </w:p>
     <w:p>
@@ -3405,7 +3416,7 @@
           <w:color w:val="263242"/>
           <w:sz w:val="18"/>
         </w:rPr>
-        <w:t>python clickstream_producer.py</w:t>
+        <w:t>python csv_producer.py</w:t>
       </w:r>
     </w:p>
     <w:p>
@@ -3423,38 +3434,18 @@
           <w:color w:val="263242"/>
           <w:sz w:val="18"/>
         </w:rPr>
-        <w:t>python csv_producer.py</w:t>
+        <w:t>docker compose down -v</w:t>
       </w:r>
     </w:p>
     <w:p>
       <w:pPr>
-        <w:pStyle w:val="Normal"/>
-        <w:spacing w:before="0" w:after="0"/>
-        <w:ind w:start="360"/>
-        <w:rPr>
-          <w:rFonts w:ascii="Calibri" w:hAnsi="Calibri"/>
-        </w:rPr>
-      </w:pPr>
-      <w:r>
-        <w:rPr>
-          <w:rFonts w:ascii="Calibri" w:hAnsi="Calibri"/>
-          <w:color w:val="263242"/>
-          <w:sz w:val="18"/>
-        </w:rPr>
-        <w:t>docker compose down -v</w:t>
-      </w:r>
-    </w:p>
-    <w:p>
-      <w:pPr>
         <w:pStyle w:val="Heading1"/>
         <w:rPr>
           <w:rFonts w:ascii="Calibri" w:hAnsi="Calibri"/>
         </w:rPr>
       </w:pPr>
       <w:r>
-        <w:rPr>
-          <w:rFonts w:ascii="Calibri" w:hAnsi="Calibri"/>
-        </w:rPr>
+        <w:rPr/>
         <w:t>Assessment Checklist</w:t>
       </w:r>
     </w:p>
@@ -3637,6 +3628,7 @@
         </w:tabs>
         <w:ind w:start="1080" w:hanging="360"/>
       </w:pPr>
+      <w:rPr/>
     </w:lvl>
     <w:lvl w:ilvl="2">
       <w:start w:val="1"/>
@@ -3649,6 +3641,7 @@
         </w:tabs>
         <w:ind w:start="1440" w:hanging="360"/>
       </w:pPr>
+      <w:rPr/>
     </w:lvl>
     <w:lvl w:ilvl="3">
       <w:start w:val="1"/>
@@ -3661,6 +3654,7 @@
         </w:tabs>
         <w:ind w:start="1800" w:hanging="360"/>
       </w:pPr>
+      <w:rPr/>
     </w:lvl>
     <w:lvl w:ilvl="4">
       <w:start w:val="1"/>
@@ -3673,6 +3667,7 @@
         </w:tabs>
         <w:ind w:start="2160" w:hanging="360"/>
       </w:pPr>
+      <w:rPr/>
     </w:lvl>
     <w:lvl w:ilvl="5">
       <w:start w:val="1"/>
@@ -3685,6 +3680,7 @@
         </w:tabs>
         <w:ind w:start="2520" w:hanging="360"/>
       </w:pPr>
+      <w:rPr/>
     </w:lvl>
     <w:lvl w:ilvl="6">
       <w:start w:val="1"/>
@@ -3697,6 +3693,7 @@
         </w:tabs>
         <w:ind w:start="2880" w:hanging="360"/>
       </w:pPr>
+      <w:rPr/>
     </w:lvl>
     <w:lvl w:ilvl="7">
       <w:start w:val="1"/>
@@ -3709,6 +3706,7 @@
         </w:tabs>
         <w:ind w:start="3240" w:hanging="360"/>
       </w:pPr>
+      <w:rPr/>
     </w:lvl>
     <w:lvl w:ilvl="8">
       <w:start w:val="1"/>
@@ -3721,6 +3719,7 @@
         </w:tabs>
         <w:ind w:start="3600" w:hanging="360"/>
       </w:pPr>
+      <w:rPr/>
     </w:lvl>
   </w:abstractNum>
   <w:abstractNum w:abstractNumId="2">
@@ -3750,6 +3749,7 @@
         </w:tabs>
         <w:ind w:start="1080" w:hanging="360"/>
       </w:pPr>
+      <w:rPr/>
     </w:lvl>
     <w:lvl w:ilvl="2">
       <w:start w:val="1"/>
@@ -3762,6 +3762,7 @@
         </w:tabs>
         <w:ind w:start="1440" w:hanging="360"/>
       </w:pPr>
+      <w:rPr/>
     </w:lvl>
     <w:lvl w:ilvl="3">
       <w:start w:val="1"/>
@@ -3774,6 +3775,7 @@
         </w:tabs>
         <w:ind w:start="1800" w:hanging="360"/>
       </w:pPr>
+      <w:rPr/>
     </w:lvl>
     <w:lvl w:ilvl="4">
       <w:start w:val="1"/>
@@ -3786,6 +3788,7 @@
         </w:tabs>
         <w:ind w:start="2160" w:hanging="360"/>
       </w:pPr>
+      <w:rPr/>
     </w:lvl>
     <w:lvl w:ilvl="5">
       <w:start w:val="1"/>
@@ -3798,6 +3801,7 @@
         </w:tabs>
         <w:ind w:start="2520" w:hanging="360"/>
       </w:pPr>
+      <w:rPr/>
     </w:lvl>
     <w:lvl w:ilvl="6">
       <w:start w:val="1"/>
@@ -3810,6 +3814,7 @@
         </w:tabs>
         <w:ind w:start="2880" w:hanging="360"/>
       </w:pPr>
+      <w:rPr/>
     </w:lvl>
     <w:lvl w:ilvl="7">
       <w:start w:val="1"/>
@@ -3822,6 +3827,7 @@
         </w:tabs>
         <w:ind w:start="3240" w:hanging="360"/>
       </w:pPr>
+      <w:rPr/>
     </w:lvl>
     <w:lvl w:ilvl="8">
       <w:start w:val="1"/>
@@ -3834,6 +3840,7 @@
         </w:tabs>
         <w:ind w:start="3600" w:hanging="360"/>
       </w:pPr>
+      <w:rPr/>
     </w:lvl>
   </w:abstractNum>
   <w:abstractNum w:abstractNumId="3">
@@ -3863,6 +3870,7 @@
         </w:tabs>
         <w:ind w:start="1080" w:hanging="360"/>
       </w:pPr>
+      <w:rPr/>
     </w:lvl>
     <w:lvl w:ilvl="2">
       <w:start w:val="1"/>
@@ -3875,6 +3883,7 @@
         </w:tabs>
         <w:ind w:start="1440" w:hanging="360"/>
       </w:pPr>
+      <w:rPr/>
     </w:lvl>
     <w:lvl w:ilvl="3">
       <w:start w:val="1"/>
@@ -3887,6 +3896,7 @@
         </w:tabs>
         <w:ind w:start="1800" w:hanging="360"/>
       </w:pPr>
+      <w:rPr/>
     </w:lvl>
     <w:lvl w:ilvl="4">
       <w:start w:val="1"/>
@@ -3899,6 +3909,7 @@
         </w:tabs>
         <w:ind w:start="2160" w:hanging="360"/>
       </w:pPr>
+      <w:rPr/>
     </w:lvl>
     <w:lvl w:ilvl="5">
       <w:start w:val="1"/>
@@ -3911,6 +3922,7 @@
         </w:tabs>
         <w:ind w:start="2520" w:hanging="360"/>
       </w:pPr>
+      <w:rPr/>
     </w:lvl>
     <w:lvl w:ilvl="6">
       <w:start w:val="1"/>
@@ -3923,6 +3935,7 @@
         </w:tabs>
         <w:ind w:start="2880" w:hanging="360"/>
       </w:pPr>
+      <w:rPr/>
     </w:lvl>
     <w:lvl w:ilvl="7">
       <w:start w:val="1"/>
@@ -3935,6 +3948,7 @@
         </w:tabs>
         <w:ind w:start="3240" w:hanging="360"/>
       </w:pPr>
+      <w:rPr/>
     </w:lvl>
     <w:lvl w:ilvl="8">
       <w:start w:val="1"/>
@@ -3947,6 +3961,7 @@
         </w:tabs>
         <w:ind w:start="3600" w:hanging="360"/>
       </w:pPr>
+      <w:rPr/>
     </w:lvl>
   </w:abstractNum>
   <w:abstractNum w:abstractNumId="4">
@@ -3974,6 +3989,7 @@
         </w:tabs>
         <w:ind w:start="1080" w:hanging="360"/>
       </w:pPr>
+      <w:rPr/>
     </w:lvl>
     <w:lvl w:ilvl="2">
       <w:start w:val="1"/>
@@ -3986,6 +4002,7 @@
         </w:tabs>
         <w:ind w:start="1440" w:hanging="360"/>
       </w:pPr>
+      <w:rPr/>
     </w:lvl>
     <w:lvl w:ilvl="3">
       <w:start w:val="1"/>
@@ -3998,6 +4015,7 @@
         </w:tabs>
         <w:ind w:start="1800" w:hanging="360"/>
       </w:pPr>
+      <w:rPr/>
     </w:lvl>
     <w:lvl w:ilvl="4">
       <w:start w:val="1"/>
@@ -4010,6 +4028,7 @@
         </w:tabs>
         <w:ind w:start="2160" w:hanging="360"/>
       </w:pPr>
+      <w:rPr/>
     </w:lvl>
     <w:lvl w:ilvl="5">
       <w:start w:val="1"/>
@@ -4022,6 +4041,7 @@
         </w:tabs>
         <w:ind w:start="2520" w:hanging="360"/>
       </w:pPr>
+      <w:rPr/>
     </w:lvl>
     <w:lvl w:ilvl="6">
       <w:start w:val="1"/>
@@ -4034,6 +4054,7 @@
         </w:tabs>
         <w:ind w:start="2880" w:hanging="360"/>
       </w:pPr>
+      <w:rPr/>
     </w:lvl>
     <w:lvl w:ilvl="7">
       <w:start w:val="1"/>
@@ -4046,6 +4067,7 @@
         </w:tabs>
         <w:ind w:start="3240" w:hanging="360"/>
       </w:pPr>
+      <w:rPr/>
     </w:lvl>
     <w:lvl w:ilvl="8">
       <w:start w:val="1"/>
@@ -4058,6 +4080,7 @@
         </w:tabs>
         <w:ind w:start="3600" w:hanging="360"/>
       </w:pPr>
+      <w:rPr/>
     </w:lvl>
   </w:abstractNum>
   <w:abstractNum w:abstractNumId="5">
@@ -4085,6 +4108,7 @@
         </w:tabs>
         <w:ind w:start="1080" w:hanging="360"/>
       </w:pPr>
+      <w:rPr/>
     </w:lvl>
     <w:lvl w:ilvl="2">
       <w:start w:val="1"/>
@@ -4097,6 +4121,7 @@
         </w:tabs>
         <w:ind w:start="1440" w:hanging="360"/>
       </w:pPr>
+      <w:rPr/>
     </w:lvl>
     <w:lvl w:ilvl="3">
       <w:start w:val="1"/>
@@ -4109,6 +4134,7 @@
         </w:tabs>
         <w:ind w:start="1800" w:hanging="360"/>
       </w:pPr>
+      <w:rPr/>
     </w:lvl>
     <w:lvl w:ilvl="4">
       <w:start w:val="1"/>
@@ -4121,6 +4147,7 @@
         </w:tabs>
         <w:ind w:start="2160" w:hanging="360"/>
       </w:pPr>
+      <w:rPr/>
     </w:lvl>
     <w:lvl w:ilvl="5">
       <w:start w:val="1"/>
@@ -4133,6 +4160,7 @@
         </w:tabs>
         <w:ind w:start="2520" w:hanging="360"/>
       </w:pPr>
+      <w:rPr/>
     </w:lvl>
     <w:lvl w:ilvl="6">
       <w:start w:val="1"/>
@@ -4145,6 +4173,7 @@
         </w:tabs>
         <w:ind w:start="2880" w:hanging="360"/>
       </w:pPr>
+      <w:rPr/>
     </w:lvl>
     <w:lvl w:ilvl="7">
       <w:start w:val="1"/>
@@ -4157,6 +4186,7 @@
         </w:tabs>
         <w:ind w:start="3240" w:hanging="360"/>
       </w:pPr>
+      <w:rPr/>
     </w:lvl>
     <w:lvl w:ilvl="8">
       <w:start w:val="1"/>
@@ -4169,6 +4199,7 @@
         </w:tabs>
         <w:ind w:start="3600" w:hanging="360"/>
       </w:pPr>
+      <w:rPr/>
     </w:lvl>
   </w:abstractNum>
   <w:abstractNum w:abstractNumId="6">
@@ -4196,6 +4227,7 @@
         </w:tabs>
         <w:ind w:start="1080" w:hanging="360"/>
       </w:pPr>
+      <w:rPr/>
     </w:lvl>
     <w:lvl w:ilvl="2">
       <w:start w:val="1"/>
@@ -4208,6 +4240,7 @@
         </w:tabs>
         <w:ind w:start="1440" w:hanging="360"/>
       </w:pPr>
+      <w:rPr/>
     </w:lvl>
     <w:lvl w:ilvl="3">
       <w:start w:val="1"/>
@@ -4220,6 +4253,7 @@
         </w:tabs>
         <w:ind w:start="1800" w:hanging="360"/>
       </w:pPr>
+      <w:rPr/>
     </w:lvl>
     <w:lvl w:ilvl="4">
       <w:start w:val="1"/>
@@ -4232,6 +4266,7 @@
         </w:tabs>
         <w:ind w:start="2160" w:hanging="360"/>
       </w:pPr>
+      <w:rPr/>
     </w:lvl>
     <w:lvl w:ilvl="5">
       <w:start w:val="1"/>
@@ -4244,6 +4279,7 @@
         </w:tabs>
         <w:ind w:start="2520" w:hanging="360"/>
       </w:pPr>
+      <w:rPr/>
     </w:lvl>
     <w:lvl w:ilvl="6">
       <w:start w:val="1"/>
@@ -4256,6 +4292,7 @@
         </w:tabs>
         <w:ind w:start="2880" w:hanging="360"/>
       </w:pPr>
+      <w:rPr/>
     </w:lvl>
     <w:lvl w:ilvl="7">
       <w:start w:val="1"/>
@@ -4268,6 +4305,7 @@
         </w:tabs>
         <w:ind w:start="3240" w:hanging="360"/>
       </w:pPr>
+      <w:rPr/>
     </w:lvl>
     <w:lvl w:ilvl="8">
       <w:start w:val="1"/>
@@ -4280,6 +4318,7 @@
         </w:tabs>
         <w:ind w:start="3600" w:hanging="360"/>
       </w:pPr>
+      <w:rPr/>
     </w:lvl>
   </w:abstractNum>
   <w:abstractNum w:abstractNumId="7">
@@ -4430,7 +4469,7 @@
   <w:docDefaults>
     <w:rPrDefault>
       <w:rPr>
-        <w:rFonts w:ascii="Cambria" w:hAnsi="Cambria" w:eastAsia="ＭＳ 明朝" w:cs="" w:asciiTheme="minorHAnsi" w:cstheme="minorBidi" w:eastAsiaTheme="minorEastAsia" w:hAnsiTheme="minorHAnsi"/>
+        <w:rFonts w:ascii="Cambria" w:hAnsi="Cambria" w:eastAsia="" w:cs="" w:asciiTheme="minorHAnsi" w:cstheme="minorBidi" w:eastAsiaTheme="minorEastAsia" w:hAnsiTheme="minorHAnsi"/>
         <w:sz w:val="22"/>
         <w:szCs w:val="22"/>
         <w:lang w:val="en-US" w:eastAsia="en-US" w:bidi="ar-SA"/>
@@ -4587,12 +4626,13 @@
     <w:rsid w:val="00fc693f"/>
     <w:pPr>
       <w:widowControl/>
+      <w:suppressAutoHyphens w:val="true"/>
       <w:bidi w:val="0"/>
       <w:spacing w:lineRule="auto" w:line="276" w:before="0" w:after="200"/>
       <w:jc w:val="start"/>
     </w:pPr>
     <w:rPr>
-      <w:rFonts w:ascii="Aptos" w:hAnsi="Aptos" w:eastAsia="ＭＳ 明朝" w:cs="" w:cstheme="minorBidi" w:eastAsiaTheme="minorEastAsia"/>
+      <w:rFonts w:ascii="Aptos" w:hAnsi="Aptos" w:eastAsia="" w:cs="" w:cstheme="minorBidi" w:eastAsiaTheme="minorEastAsia"/>
       <w:color w:val="auto"/>
       <w:kern w:val="0"/>
       <w:sz w:val="21"/>
@@ -4615,7 +4655,7 @@
       <w:outlineLvl w:val="0"/>
     </w:pPr>
     <w:rPr>
-      <w:rFonts w:ascii="Calibri" w:hAnsi="Calibri" w:eastAsia="ＭＳ ゴシック" w:cs="" w:asciiTheme="majorHAnsi" w:cstheme="majorBidi" w:eastAsiaTheme="majorEastAsia" w:hAnsiTheme="majorHAnsi"/>
+      <w:rFonts w:ascii="Calibri" w:hAnsi="Calibri" w:eastAsia="" w:cs="" w:asciiTheme="majorHAnsi" w:cstheme="majorBidi" w:eastAsiaTheme="majorEastAsia" w:hAnsiTheme="majorHAnsi"/>
       <w:b/>
       <w:bCs/>
       <w:color w:val="0C1220"/>
@@ -4639,7 +4679,7 @@
       <w:outlineLvl w:val="1"/>
     </w:pPr>
     <w:rPr>
-      <w:rFonts w:ascii="Calibri" w:hAnsi="Calibri" w:eastAsia="ＭＳ ゴシック" w:cs="" w:asciiTheme="majorHAnsi" w:cstheme="majorBidi" w:eastAsiaTheme="majorEastAsia" w:hAnsiTheme="majorHAnsi"/>
+      <w:rFonts w:ascii="Calibri" w:hAnsi="Calibri" w:eastAsia="" w:cs="" w:asciiTheme="majorHAnsi" w:cstheme="majorBidi" w:eastAsiaTheme="majorEastAsia" w:hAnsiTheme="majorHAnsi"/>
       <w:b/>
       <w:bCs/>
       <w:color w:val="007480"/>
@@ -4663,7 +4703,7 @@
       <w:outlineLvl w:val="2"/>
     </w:pPr>
     <w:rPr>
-      <w:rFonts w:ascii="Calibri" w:hAnsi="Calibri" w:eastAsia="ＭＳ ゴシック" w:cs="" w:asciiTheme="majorHAnsi" w:cstheme="majorBidi" w:eastAsiaTheme="majorEastAsia" w:hAnsiTheme="majorHAnsi"/>
+      <w:rFonts w:ascii="Calibri" w:hAnsi="Calibri" w:eastAsia="" w:cs="" w:asciiTheme="majorHAnsi" w:cstheme="majorBidi" w:eastAsiaTheme="majorEastAsia" w:hAnsiTheme="majorHAnsi"/>
       <w:b/>
       <w:bCs/>
       <w:color w:themeColor="accent1" w:val="4F81BD"/>
@@ -4686,7 +4726,7 @@
       <w:outlineLvl w:val="3"/>
     </w:pPr>
     <w:rPr>
-      <w:rFonts w:ascii="Calibri" w:hAnsi="Calibri" w:eastAsia="ＭＳ ゴシック" w:cs="" w:asciiTheme="majorHAnsi" w:cstheme="majorBidi" w:eastAsiaTheme="majorEastAsia" w:hAnsiTheme="majorHAnsi"/>
+      <w:rFonts w:ascii="Calibri" w:hAnsi="Calibri" w:eastAsia="" w:cs="" w:asciiTheme="majorHAnsi" w:cstheme="majorBidi" w:eastAsiaTheme="majorEastAsia" w:hAnsiTheme="majorHAnsi"/>
       <w:b/>
       <w:bCs/>
       <w:i/>
@@ -4711,7 +4751,7 @@
       <w:outlineLvl w:val="4"/>
     </w:pPr>
     <w:rPr>
-      <w:rFonts w:ascii="Calibri" w:hAnsi="Calibri" w:eastAsia="ＭＳ ゴシック" w:cs="" w:asciiTheme="majorHAnsi" w:cstheme="majorBidi" w:eastAsiaTheme="majorEastAsia" w:hAnsiTheme="majorHAnsi"/>
+      <w:rFonts w:ascii="Calibri" w:hAnsi="Calibri" w:eastAsia="" w:cs="" w:asciiTheme="majorHAnsi" w:cstheme="majorBidi" w:eastAsiaTheme="majorEastAsia" w:hAnsiTheme="majorHAnsi"/>
       <w:color w:themeColor="accent1" w:themeShade="7f" w:val="243F60"/>
     </w:rPr>
   </w:style>
@@ -4732,7 +4772,7 @@
       <w:outlineLvl w:val="5"/>
     </w:pPr>
     <w:rPr>
-      <w:rFonts w:ascii="Calibri" w:hAnsi="Calibri" w:eastAsia="ＭＳ ゴシック" w:cs="" w:asciiTheme="majorHAnsi" w:cstheme="majorBidi" w:eastAsiaTheme="majorEastAsia" w:hAnsiTheme="majorHAnsi"/>
+      <w:rFonts w:ascii="Calibri" w:hAnsi="Calibri" w:eastAsia="" w:cs="" w:asciiTheme="majorHAnsi" w:cstheme="majorBidi" w:eastAsiaTheme="majorEastAsia" w:hAnsiTheme="majorHAnsi"/>
       <w:i/>
       <w:iCs/>
       <w:color w:themeColor="accent1" w:themeShade="7f" w:val="243F60"/>
@@ -4755,7 +4795,7 @@
       <w:outlineLvl w:val="6"/>
     </w:pPr>
     <w:rPr>
-      <w:rFonts w:ascii="Calibri" w:hAnsi="Calibri" w:eastAsia="ＭＳ ゴシック" w:cs="" w:asciiTheme="majorHAnsi" w:cstheme="majorBidi" w:eastAsiaTheme="majorEastAsia" w:hAnsiTheme="majorHAnsi"/>
+      <w:rFonts w:ascii="Calibri" w:hAnsi="Calibri" w:eastAsia="" w:cs="" w:asciiTheme="majorHAnsi" w:cstheme="majorBidi" w:eastAsiaTheme="majorEastAsia" w:hAnsiTheme="majorHAnsi"/>
       <w:i/>
       <w:iCs/>
       <w:color w:themeColor="text1" w:themeTint="bf" w:val="404040"/>
@@ -4778,7 +4818,7 @@
       <w:outlineLvl w:val="7"/>
     </w:pPr>
     <w:rPr>
-      <w:rFonts w:ascii="Calibri" w:hAnsi="Calibri" w:eastAsia="ＭＳ ゴシック" w:cs="" w:asciiTheme="majorHAnsi" w:cstheme="majorBidi" w:eastAsiaTheme="majorEastAsia" w:hAnsiTheme="majorHAnsi"/>
+      <w:rFonts w:ascii="Calibri" w:hAnsi="Calibri" w:eastAsia="" w:cs="" w:asciiTheme="majorHAnsi" w:cstheme="majorBidi" w:eastAsiaTheme="majorEastAsia" w:hAnsiTheme="majorHAnsi"/>
       <w:color w:themeColor="accent1" w:val="4F81BD"/>
       <w:sz w:val="20"/>
       <w:szCs w:val="20"/>
@@ -4801,7 +4841,7 @@
       <w:outlineLvl w:val="8"/>
     </w:pPr>
     <w:rPr>
-      <w:rFonts w:ascii="Calibri" w:hAnsi="Calibri" w:eastAsia="ＭＳ ゴシック" w:cs="" w:asciiTheme="majorHAnsi" w:cstheme="majorBidi" w:eastAsiaTheme="majorEastAsia" w:hAnsiTheme="majorHAnsi"/>
+      <w:rFonts w:ascii="Calibri" w:hAnsi="Calibri" w:eastAsia="" w:cs="" w:asciiTheme="majorHAnsi" w:cstheme="majorBidi" w:eastAsiaTheme="majorEastAsia" w:hAnsiTheme="majorHAnsi"/>
       <w:i/>
       <w:iCs/>
       <w:color w:themeColor="text1" w:themeTint="bf" w:val="404040"/>
@@ -4843,7 +4883,7 @@
     <w:qFormat/>
     <w:rsid w:val="00fc693f"/>
     <w:rPr>
-      <w:rFonts w:ascii="Calibri" w:hAnsi="Calibri" w:eastAsia="ＭＳ ゴシック" w:cs="" w:asciiTheme="majorHAnsi" w:cstheme="majorBidi" w:eastAsiaTheme="majorEastAsia" w:hAnsiTheme="majorHAnsi"/>
+      <w:rFonts w:ascii="Calibri" w:hAnsi="Calibri" w:eastAsia="" w:cs="" w:asciiTheme="majorHAnsi" w:cstheme="majorBidi" w:eastAsiaTheme="majorEastAsia" w:hAnsiTheme="majorHAnsi"/>
       <w:b/>
       <w:bCs/>
       <w:color w:themeColor="accent1" w:themeShade="bf" w:val="365F91"/>
@@ -4859,7 +4899,7 @@
     <w:qFormat/>
     <w:rsid w:val="00fc693f"/>
     <w:rPr>
-      <w:rFonts w:ascii="Calibri" w:hAnsi="Calibri" w:eastAsia="ＭＳ ゴシック" w:cs="" w:asciiTheme="majorHAnsi" w:cstheme="majorBidi" w:eastAsiaTheme="majorEastAsia" w:hAnsiTheme="majorHAnsi"/>
+      <w:rFonts w:ascii="Calibri" w:hAnsi="Calibri" w:eastAsia="" w:cs="" w:asciiTheme="majorHAnsi" w:cstheme="majorBidi" w:eastAsiaTheme="majorEastAsia" w:hAnsiTheme="majorHAnsi"/>
       <w:b/>
       <w:bCs/>
       <w:color w:themeColor="accent1" w:val="4F81BD"/>
@@ -4875,7 +4915,7 @@
     <w:qFormat/>
     <w:rsid w:val="00fc693f"/>
     <w:rPr>
-      <w:rFonts w:ascii="Calibri" w:hAnsi="Calibri" w:eastAsia="ＭＳ ゴシック" w:cs="" w:asciiTheme="majorHAnsi" w:cstheme="majorBidi" w:eastAsiaTheme="majorEastAsia" w:hAnsiTheme="majorHAnsi"/>
+      <w:rFonts w:ascii="Calibri" w:hAnsi="Calibri" w:eastAsia="" w:cs="" w:asciiTheme="majorHAnsi" w:cstheme="majorBidi" w:eastAsiaTheme="majorEastAsia" w:hAnsiTheme="majorHAnsi"/>
       <w:b/>
       <w:bCs/>
       <w:color w:themeColor="accent1" w:val="4F81BD"/>
@@ -4889,7 +4929,7 @@
     <w:qFormat/>
     <w:rsid w:val="00fc693f"/>
     <w:rPr>
-      <w:rFonts w:ascii="Calibri" w:hAnsi="Calibri" w:eastAsia="ＭＳ ゴシック" w:cs="" w:asciiTheme="majorHAnsi" w:cstheme="majorBidi" w:eastAsiaTheme="majorEastAsia" w:hAnsiTheme="majorHAnsi"/>
+      <w:rFonts w:ascii="Calibri" w:hAnsi="Calibri" w:eastAsia="" w:cs="" w:asciiTheme="majorHAnsi" w:cstheme="majorBidi" w:eastAsiaTheme="majorEastAsia" w:hAnsiTheme="majorHAnsi"/>
       <w:color w:themeColor="text2" w:themeShade="bf" w:val="17365D"/>
       <w:spacing w:val="5"/>
       <w:kern w:val="2"/>
@@ -4905,7 +4945,7 @@
     <w:qFormat/>
     <w:rsid w:val="00fc693f"/>
     <w:rPr>
-      <w:rFonts w:ascii="Calibri" w:hAnsi="Calibri" w:eastAsia="ＭＳ ゴシック" w:cs="" w:asciiTheme="majorHAnsi" w:cstheme="majorBidi" w:eastAsiaTheme="majorEastAsia" w:hAnsiTheme="majorHAnsi"/>
+      <w:rFonts w:ascii="Calibri" w:hAnsi="Calibri" w:eastAsia="" w:cs="" w:asciiTheme="majorHAnsi" w:cstheme="majorBidi" w:eastAsiaTheme="majorEastAsia" w:hAnsiTheme="majorHAnsi"/>
       <w:i/>
       <w:iCs/>
       <w:color w:themeColor="accent1" w:val="4F81BD"/>
@@ -4978,7 +5018,7 @@
     <w:qFormat/>
     <w:rsid w:val="00fc693f"/>
     <w:rPr>
-      <w:rFonts w:ascii="Calibri" w:hAnsi="Calibri" w:eastAsia="ＭＳ ゴシック" w:cs="" w:asciiTheme="majorHAnsi" w:cstheme="majorBidi" w:eastAsiaTheme="majorEastAsia" w:hAnsiTheme="majorHAnsi"/>
+      <w:rFonts w:ascii="Calibri" w:hAnsi="Calibri" w:eastAsia="" w:cs="" w:asciiTheme="majorHAnsi" w:cstheme="majorBidi" w:eastAsiaTheme="majorEastAsia" w:hAnsiTheme="majorHAnsi"/>
       <w:b/>
       <w:bCs/>
       <w:i/>
@@ -4995,7 +5035,7 @@
     <w:qFormat/>
     <w:rsid w:val="00fc693f"/>
     <w:rPr>
-      <w:rFonts w:ascii="Calibri" w:hAnsi="Calibri" w:eastAsia="ＭＳ ゴシック" w:cs="" w:asciiTheme="majorHAnsi" w:cstheme="majorBidi" w:eastAsiaTheme="majorEastAsia" w:hAnsiTheme="majorHAnsi"/>
+      <w:rFonts w:ascii="Calibri" w:hAnsi="Calibri" w:eastAsia="" w:cs="" w:asciiTheme="majorHAnsi" w:cstheme="majorBidi" w:eastAsiaTheme="majorEastAsia" w:hAnsiTheme="majorHAnsi"/>
       <w:color w:themeColor="accent1" w:themeShade="7f" w:val="243F60"/>
     </w:rPr>
   </w:style>
@@ -5008,7 +5048,7 @@
     <w:qFormat/>
     <w:rsid w:val="00fc693f"/>
     <w:rPr>
-      <w:rFonts w:ascii="Calibri" w:hAnsi="Calibri" w:eastAsia="ＭＳ ゴシック" w:cs="" w:asciiTheme="majorHAnsi" w:cstheme="majorBidi" w:eastAsiaTheme="majorEastAsia" w:hAnsiTheme="majorHAnsi"/>
+      <w:rFonts w:ascii="Calibri" w:hAnsi="Calibri" w:eastAsia="" w:cs="" w:asciiTheme="majorHAnsi" w:cstheme="majorBidi" w:eastAsiaTheme="majorEastAsia" w:hAnsiTheme="majorHAnsi"/>
       <w:i/>
       <w:iCs/>
       <w:color w:themeColor="accent1" w:themeShade="7f" w:val="243F60"/>
@@ -5023,7 +5063,7 @@
     <w:qFormat/>
     <w:rsid w:val="00fc693f"/>
     <w:rPr>
-      <w:rFonts w:ascii="Calibri" w:hAnsi="Calibri" w:eastAsia="ＭＳ ゴシック" w:cs="" w:asciiTheme="majorHAnsi" w:cstheme="majorBidi" w:eastAsiaTheme="majorEastAsia" w:hAnsiTheme="majorHAnsi"/>
+      <w:rFonts w:ascii="Calibri" w:hAnsi="Calibri" w:eastAsia="" w:cs="" w:asciiTheme="majorHAnsi" w:cstheme="majorBidi" w:eastAsiaTheme="majorEastAsia" w:hAnsiTheme="majorHAnsi"/>
       <w:i/>
       <w:iCs/>
       <w:color w:themeColor="text1" w:themeTint="bf" w:val="404040"/>
@@ -5038,7 +5078,7 @@
     <w:qFormat/>
     <w:rsid w:val="00fc693f"/>
     <w:rPr>
-      <w:rFonts w:ascii="Calibri" w:hAnsi="Calibri" w:eastAsia="ＭＳ ゴシック" w:cs="" w:asciiTheme="majorHAnsi" w:cstheme="majorBidi" w:eastAsiaTheme="majorEastAsia" w:hAnsiTheme="majorHAnsi"/>
+      <w:rFonts w:ascii="Calibri" w:hAnsi="Calibri" w:eastAsia="" w:cs="" w:asciiTheme="majorHAnsi" w:cstheme="majorBidi" w:eastAsiaTheme="majorEastAsia" w:hAnsiTheme="majorHAnsi"/>
       <w:color w:themeColor="accent1" w:val="4F81BD"/>
       <w:sz w:val="20"/>
       <w:szCs w:val="20"/>
@@ -5053,7 +5093,7 @@
     <w:qFormat/>
     <w:rsid w:val="00fc693f"/>
     <w:rPr>
-      <w:rFonts w:ascii="Calibri" w:hAnsi="Calibri" w:eastAsia="ＭＳ ゴシック" w:cs="" w:asciiTheme="majorHAnsi" w:cstheme="majorBidi" w:eastAsiaTheme="majorEastAsia" w:hAnsiTheme="majorHAnsi"/>
+      <w:rFonts w:ascii="Calibri" w:hAnsi="Calibri" w:eastAsia="" w:cs="" w:asciiTheme="majorHAnsi" w:cstheme="majorBidi" w:eastAsiaTheme="majorEastAsia" w:hAnsiTheme="majorHAnsi"/>
       <w:i/>
       <w:iCs/>
       <w:color w:themeColor="text1" w:themeTint="bf" w:val="404040"/>
@@ -5283,12 +5323,13 @@
     <w:rsid w:val="00fc693f"/>
     <w:pPr>
       <w:widowControl/>
+      <w:suppressAutoHyphens w:val="true"/>
       <w:bidi w:val="0"/>
       <w:spacing w:lineRule="auto" w:line="240" w:before="0" w:after="0"/>
       <w:jc w:val="start"/>
     </w:pPr>
     <w:rPr>
-      <w:rFonts w:ascii="Cambria" w:hAnsi="Cambria" w:eastAsia="ＭＳ 明朝" w:cs="" w:asciiTheme="minorHAnsi" w:cstheme="minorBidi" w:eastAsiaTheme="minorEastAsia" w:hAnsiTheme="minorHAnsi"/>
+      <w:rFonts w:ascii="Cambria" w:hAnsi="Cambria" w:eastAsia="" w:cs="" w:asciiTheme="minorHAnsi" w:cstheme="minorBidi" w:eastAsiaTheme="minorEastAsia" w:hAnsiTheme="minorHAnsi"/>
       <w:color w:val="auto"/>
       <w:kern w:val="0"/>
       <w:sz w:val="22"/>
@@ -5312,7 +5353,7 @@
       <w:contextualSpacing/>
     </w:pPr>
     <w:rPr>
-      <w:rFonts w:ascii="Calibri" w:hAnsi="Calibri" w:eastAsia="ＭＳ ゴシック" w:cs="" w:asciiTheme="majorHAnsi" w:cstheme="majorBidi" w:eastAsiaTheme="majorEastAsia" w:hAnsiTheme="majorHAnsi"/>
+      <w:rFonts w:ascii="Calibri" w:hAnsi="Calibri" w:eastAsia="" w:cs="" w:asciiTheme="majorHAnsi" w:cstheme="majorBidi" w:eastAsiaTheme="majorEastAsia" w:hAnsiTheme="majorHAnsi"/>
       <w:color w:themeColor="text2" w:themeShade="bf" w:val="17365D"/>
       <w:spacing w:val="5"/>
       <w:kern w:val="2"/>
@@ -5330,7 +5371,7 @@
     <w:rsid w:val="00fc693f"/>
     <w:pPr/>
     <w:rPr>
-      <w:rFonts w:ascii="Calibri" w:hAnsi="Calibri" w:eastAsia="ＭＳ ゴシック" w:cs="" w:asciiTheme="majorHAnsi" w:cstheme="majorBidi" w:eastAsiaTheme="majorEastAsia" w:hAnsiTheme="majorHAnsi"/>
+      <w:rFonts w:ascii="Calibri" w:hAnsi="Calibri" w:eastAsia="" w:cs="" w:asciiTheme="majorHAnsi" w:cstheme="majorBidi" w:eastAsiaTheme="majorEastAsia" w:hAnsiTheme="majorHAnsi"/>
       <w:i/>
       <w:iCs/>
       <w:color w:themeColor="accent1" w:val="4F81BD"/>
@@ -5563,12 +5604,13 @@
         <w:tab w:val="left" w:pos="3456" w:leader="none"/>
         <w:tab w:val="left" w:pos="4032" w:leader="none"/>
       </w:tabs>
+      <w:suppressAutoHyphens w:val="true"/>
       <w:bidi w:val="0"/>
       <w:spacing w:lineRule="auto" w:line="276" w:before="0" w:after="200"/>
       <w:jc w:val="start"/>
     </w:pPr>
     <w:rPr>
-      <w:rFonts w:ascii="Courier" w:hAnsi="Courier" w:eastAsia="ＭＳ 明朝" w:cs="" w:cstheme="minorBidi" w:eastAsiaTheme="minorEastAsia"/>
+      <w:rFonts w:ascii="Courier" w:hAnsi="Courier" w:eastAsia="" w:cs="" w:cstheme="minorBidi" w:eastAsiaTheme="minorEastAsia"/>
       <w:color w:val="auto"/>
       <w:kern w:val="0"/>
       <w:sz w:val="20"/>
@@ -8766,7 +8808,6 @@
       <w:pPr>
         <w:spacing w:before="0" w:after="0" w:line="240" w:lineRule="auto"/>
       </w:pPr>
-      <w:rPr/>
       <w:tblPr/>
       <w:tcPr>
         <w:tcBorders>
@@ -8912,7 +8953,6 @@
       <w:pPr>
         <w:spacing w:before="0" w:after="0" w:line="240" w:lineRule="auto"/>
       </w:pPr>
-      <w:rPr/>
       <w:tblPr/>
       <w:tcPr>
         <w:tcBorders>
@@ -9058,7 +9098,6 @@
       <w:pPr>
         <w:spacing w:before="0" w:after="0" w:line="240" w:lineRule="auto"/>
       </w:pPr>
-      <w:rPr/>
       <w:tblPr/>
       <w:tcPr>
         <w:tcBorders>
@@ -9204,7 +9243,6 @@
       <w:pPr>
         <w:spacing w:before="0" w:after="0" w:line="240" w:lineRule="auto"/>
       </w:pPr>
-      <w:rPr/>
       <w:tblPr/>
       <w:tcPr>
         <w:tcBorders>
@@ -9350,7 +9388,6 @@
       <w:pPr>
         <w:spacing w:before="0" w:after="0" w:line="240" w:lineRule="auto"/>
       </w:pPr>
-      <w:rPr/>
       <w:tblPr/>
       <w:tcPr>
         <w:tcBorders>
@@ -9496,7 +9533,6 @@
       <w:pPr>
         <w:spacing w:before="0" w:after="0" w:line="240" w:lineRule="auto"/>
       </w:pPr>
-      <w:rPr/>
       <w:tblPr/>
       <w:tcPr>
         <w:tcBorders>
@@ -9642,7 +9678,6 @@
       <w:pPr>
         <w:spacing w:before="0" w:after="0" w:line="240" w:lineRule="auto"/>
       </w:pPr>
-      <w:rPr/>
       <w:tblPr/>
       <w:tcPr>
         <w:tcBorders>

</xml_diff>